<commit_message>
Add figures and step-by-step reading guide to ILO board notes
Co-Authored-By: Claude Sonnet 5.5 <noreply@anthropic.com>
Claude-Session: https://claude.ai/code/session_01ANYSSQ1xyWYt7dPU8XV1wB
</commit_message>
<xml_diff>
--- a/PPDS Okupasi Board Notes/Catatan ILO Radiograph.docx
+++ b/PPDS Okupasi Board Notes/Catatan ILO Radiograph.docx
@@ -3503,6 +3503,220 @@
       </w:pPr>
     </w:p>
     <w:p>
+      <w:pPr>
+        <w:keepNext/>
+        <w:jc w:val="center"/>
+      </w:pPr>
+      <w:r>
+        <w:drawing>
+          <wp:inline xmlns:a="http://schemas.openxmlformats.org/drawingml/2006/main" xmlns:pic="http://schemas.openxmlformats.org/drawingml/2006/picture">
+            <wp:extent cx="3240000" cy="3677400"/>
+            <wp:docPr id="1" name="Picture 1"/>
+            <wp:cNvGraphicFramePr>
+              <a:graphicFrameLocks noChangeAspect="1"/>
+            </wp:cNvGraphicFramePr>
+            <a:graphic>
+              <a:graphicData uri="http://schemas.openxmlformats.org/drawingml/2006/picture">
+                <pic:pic>
+                  <pic:nvPicPr>
+                    <pic:cNvPr id="0" name="normal.jpg"/>
+                    <pic:cNvPicPr/>
+                  </pic:nvPicPr>
+                  <pic:blipFill>
+                    <a:blip r:embed="rId9"/>
+                    <a:stretch>
+                      <a:fillRect/>
+                    </a:stretch>
+                  </pic:blipFill>
+                  <pic:spPr>
+                    <a:xfrm>
+                      <a:off x="0" y="0"/>
+                      <a:ext cx="3240000" cy="3677400"/>
+                    </a:xfrm>
+                    <a:prstGeom prst="rect"/>
+                  </pic:spPr>
+                </pic:pic>
+              </a:graphicData>
+            </a:graphic>
+          </wp:inline>
+        </w:drawing>
+      </w:r>
+    </w:p>
+    <w:p>
+      <w:pPr>
+        <w:jc w:val="center"/>
+      </w:pPr>
+      <w:r>
+        <w:rPr>
+          <w:b/>
+          <w:i/>
+          <w:sz w:val="18"/>
+        </w:rPr>
+        <w:t>Gambar 4.1.</w:t>
+      </w:r>
+      <w:r>
+        <w:rPr>
+          <w:b w:val="0"/>
+          <w:i/>
+          <w:sz w:val="18"/>
+        </w:rPr>
+        <w:t xml:space="preserve"> Contoh film kualitas grade 1: standar ILO 0/0 (contoh 1). Pembuluh darah perifer terlihat jelas, tanpa skapula di lapangan paru, tanpa artefak. Sumber: ILO standard digital images 2022.</w:t>
+      </w:r>
+    </w:p>
+    <w:p>
+      <w:r>
+        <w:rPr>
+          <w:b/>
+          <w:i w:val="0"/>
+        </w:rPr>
+        <w:t>Cara menilai kualitas langsung di film (lima cek):</w:t>
+      </w:r>
+    </w:p>
+    <w:p>
+      <w:pPr>
+        <w:spacing w:after="40"/>
+        <w:ind w:left="510" w:hanging="340"/>
+      </w:pPr>
+      <w:r>
+        <w:rPr>
+          <w:b w:val="0"/>
+          <w:i w:val="0"/>
+        </w:rPr>
+        <w:t xml:space="preserve">1. </w:t>
+      </w:r>
+      <w:r>
+        <w:rPr>
+          <w:b/>
+          <w:i w:val="0"/>
+        </w:rPr>
+        <w:t>Inspirasi:</w:t>
+      </w:r>
+      <w:r>
+        <w:rPr>
+          <w:b w:val="0"/>
+          <w:i w:val="0"/>
+        </w:rPr>
+        <w:t xml:space="preserve"> hitung iga posterior di atas kubah diafragma kanan. Puncak hemidiafragma harus setinggi iga posterior ke-10 atau lebih rendah. Kurang dari itu = underinflation.</w:t>
+      </w:r>
+    </w:p>
+    <w:p>
+      <w:pPr>
+        <w:spacing w:after="40"/>
+        <w:ind w:left="510" w:hanging="340"/>
+      </w:pPr>
+      <w:r>
+        <w:rPr>
+          <w:b w:val="0"/>
+          <w:i w:val="0"/>
+        </w:rPr>
+        <w:t xml:space="preserve">2. </w:t>
+      </w:r>
+      <w:r>
+        <w:rPr>
+          <w:b/>
+          <w:i w:val="0"/>
+        </w:rPr>
+        <w:t>Rotasi/posisi:</w:t>
+      </w:r>
+      <w:r>
+        <w:rPr>
+          <w:b w:val="0"/>
+          <w:i w:val="0"/>
+        </w:rPr>
+        <w:t xml:space="preserve"> ujung medial klavikula kanan dan kiri harus sama jauh dari prosesus spinosus vertebra.</w:t>
+      </w:r>
+    </w:p>
+    <w:p>
+      <w:pPr>
+        <w:spacing w:after="40"/>
+        <w:ind w:left="510" w:hanging="340"/>
+      </w:pPr>
+      <w:r>
+        <w:rPr>
+          <w:b w:val="0"/>
+          <w:i w:val="0"/>
+        </w:rPr>
+        <w:t xml:space="preserve">3. </w:t>
+      </w:r>
+      <w:r>
+        <w:rPr>
+          <w:b/>
+          <w:i w:val="0"/>
+        </w:rPr>
+        <w:t>Skapula:</w:t>
+      </w:r>
+      <w:r>
+        <w:rPr>
+          <w:b w:val="0"/>
+          <w:i w:val="0"/>
+        </w:rPr>
+        <w:t xml:space="preserve"> harus di luar lapangan paru. Bila menutupi lapangan paru = scapula overlay.</w:t>
+      </w:r>
+    </w:p>
+    <w:p>
+      <w:pPr>
+        <w:spacing w:after="40"/>
+        <w:ind w:left="510" w:hanging="340"/>
+      </w:pPr>
+      <w:r>
+        <w:rPr>
+          <w:b w:val="0"/>
+          <w:i w:val="0"/>
+        </w:rPr>
+        <w:t xml:space="preserve">4. </w:t>
+      </w:r>
+      <w:r>
+        <w:rPr>
+          <w:b/>
+          <w:i w:val="0"/>
+        </w:rPr>
+        <w:t>Penetrasi dan kontras:</w:t>
+      </w:r>
+      <w:r>
+        <w:rPr>
+          <w:b w:val="0"/>
+          <w:i w:val="0"/>
+        </w:rPr>
+        <w:t xml:space="preserve"> vertebra dan diskus tampak samar di belakang jantung, pembuluh perifer terlihat sampai tepi paru. Terlalu gelap = overexposed, terlalu terang = underexposed.</w:t>
+      </w:r>
+    </w:p>
+    <w:p>
+      <w:pPr>
+        <w:spacing w:after="40"/>
+        <w:ind w:left="510" w:hanging="340"/>
+      </w:pPr>
+      <w:r>
+        <w:rPr>
+          <w:b w:val="0"/>
+          <w:i w:val="0"/>
+        </w:rPr>
+        <w:t xml:space="preserve">5. </w:t>
+      </w:r>
+      <w:r>
+        <w:rPr>
+          <w:b/>
+          <w:i w:val="0"/>
+        </w:rPr>
+        <w:t>Artefak dan kabut:</w:t>
+      </w:r>
+      <w:r>
+        <w:rPr>
+          <w:b w:val="0"/>
+          <w:i w:val="0"/>
+        </w:rPr>
+        <w:t xml:space="preserve"> pakaian, rambut, elektroda, mottle/noise, motion blur, apeks atau sudut kostofrenikus terpotong.</w:t>
+      </w:r>
+    </w:p>
+    <w:p>
+      <w:r>
+        <w:rPr>
+          <w:b w:val="0"/>
+          <w:i w:val="0"/>
+        </w:rPr>
+        <w:t>Catatan resmi: pada set standar ILO 2022, contoh 0/0 kedua dinilai kualitas 2 (scapular overlay). Standar digital dipilih untuk menunjukkan gambaran pneumokoniosis, bukan untuk menunjukkan kualitas teknis terbaik, sehingga banyak standar bernilai kualitas 2.</w:t>
+      </w:r>
+    </w:p>
+    <w:p>
       <w:r>
         <w:rPr>
           <w:b w:val="0"/>
@@ -4588,6 +4802,67 @@
       </w:pPr>
       <w:r>
         <w:t>6.1 Opasitas kecil</w:t>
+      </w:r>
+    </w:p>
+    <w:p>
+      <w:pPr>
+        <w:keepNext/>
+        <w:jc w:val="center"/>
+      </w:pPr>
+      <w:r>
+        <w:drawing>
+          <wp:inline xmlns:a="http://schemas.openxmlformats.org/drawingml/2006/main" xmlns:pic="http://schemas.openxmlformats.org/drawingml/2006/picture">
+            <wp:extent cx="4140000" cy="6098410"/>
+            <wp:docPr id="2" name="Picture 2"/>
+            <wp:cNvGraphicFramePr>
+              <a:graphicFrameLocks noChangeAspect="1"/>
+            </wp:cNvGraphicFramePr>
+            <a:graphic>
+              <a:graphicData uri="http://schemas.openxmlformats.org/drawingml/2006/picture">
+                <pic:pic>
+                  <pic:nvPicPr>
+                    <pic:cNvPr id="0" name="g_fig1.png"/>
+                    <pic:cNvPicPr/>
+                  </pic:nvPicPr>
+                  <pic:blipFill>
+                    <a:blip r:embed="rId10"/>
+                    <a:stretch>
+                      <a:fillRect/>
+                    </a:stretch>
+                  </pic:blipFill>
+                  <pic:spPr>
+                    <a:xfrm>
+                      <a:off x="0" y="0"/>
+                      <a:ext cx="4140000" cy="6098410"/>
+                    </a:xfrm>
+                    <a:prstGeom prst="rect"/>
+                  </pic:spPr>
+                </pic:pic>
+              </a:graphicData>
+            </a:graphic>
+          </wp:inline>
+        </w:drawing>
+      </w:r>
+    </w:p>
+    <w:p>
+      <w:pPr>
+        <w:jc w:val="center"/>
+      </w:pPr>
+      <w:r>
+        <w:rPr>
+          <w:b/>
+          <w:i/>
+          <w:sz w:val="18"/>
+        </w:rPr>
+        <w:t>Gambar 6.1.</w:t>
+      </w:r>
+      <w:r>
+        <w:rPr>
+          <w:b w:val="0"/>
+          <w:i/>
+          <w:sz w:val="18"/>
+        </w:rPr>
+        <w:t xml:space="preserve"> Panduan bergambar ILO: kiri atas profusion 0/- sampai 3/+, tengah bawah bentuk dan ukuran (p/q/r bulat, s/t/u ireguler, contoh qq, qt, tq, tt), bawah opasitas besar A, B, C dan zona atas kanan (RUZ). Sumber: ILO Guidelines 2022, Figure 1. Gambar ini hanya pengingat, film standar tetap menjadi acuan.</w:t>
       </w:r>
     </w:p>
     <w:tbl>
@@ -4993,6 +5268,189 @@
     </w:p>
     <w:p>
       <w:pPr>
+        <w:keepNext/>
+        <w:jc w:val="center"/>
+      </w:pPr>
+      <w:r>
+        <w:drawing>
+          <wp:inline xmlns:a="http://schemas.openxmlformats.org/drawingml/2006/main" xmlns:pic="http://schemas.openxmlformats.org/drawingml/2006/picture">
+            <wp:extent cx="5040000" cy="5720400"/>
+            <wp:docPr id="3" name="Picture 3"/>
+            <wp:cNvGraphicFramePr>
+              <a:graphicFrameLocks noChangeAspect="1"/>
+            </wp:cNvGraphicFramePr>
+            <a:graphic>
+              <a:graphicData uri="http://schemas.openxmlformats.org/drawingml/2006/picture">
+                <pic:pic>
+                  <pic:nvPicPr>
+                    <pic:cNvPr id="0" name="profusion.jpg"/>
+                    <pic:cNvPicPr/>
+                  </pic:nvPicPr>
+                  <pic:blipFill>
+                    <a:blip r:embed="rId11"/>
+                    <a:stretch>
+                      <a:fillRect/>
+                    </a:stretch>
+                  </pic:blipFill>
+                  <pic:spPr>
+                    <a:xfrm>
+                      <a:off x="0" y="0"/>
+                      <a:ext cx="5040000" cy="5720400"/>
+                    </a:xfrm>
+                    <a:prstGeom prst="rect"/>
+                  </pic:spPr>
+                </pic:pic>
+              </a:graphicData>
+            </a:graphic>
+          </wp:inline>
+        </w:drawing>
+      </w:r>
+    </w:p>
+    <w:p>
+      <w:pPr>
+        <w:jc w:val="center"/>
+      </w:pPr>
+      <w:r>
+        <w:rPr>
+          <w:b/>
+          <w:i/>
+          <w:sz w:val="18"/>
+        </w:rPr>
+        <w:t>Gambar 6.2.</w:t>
+      </w:r>
+      <w:r>
+        <w:rPr>
+          <w:b w:val="0"/>
+          <w:i/>
+          <w:sz w:val="18"/>
+        </w:rPr>
+        <w:t xml:space="preserve"> Film standar ILO dengan bentuk q/q: profusion 0/0, 1/1, 2/2, 3/3. Lihat bagaimana corakan vaskular normal makin tertutup oleh bintik halus. Sumber: ILO standard digital images 2022.</w:t>
+      </w:r>
+    </w:p>
+    <w:p>
+      <w:pPr>
+        <w:keepNext/>
+        <w:jc w:val="center"/>
+      </w:pPr>
+      <w:r>
+        <w:drawing>
+          <wp:inline xmlns:a="http://schemas.openxmlformats.org/drawingml/2006/main" xmlns:pic="http://schemas.openxmlformats.org/drawingml/2006/picture">
+            <wp:extent cx="5760000" cy="1533600"/>
+            <wp:docPr id="4" name="Picture 4"/>
+            <wp:cNvGraphicFramePr>
+              <a:graphicFrameLocks noChangeAspect="1"/>
+            </wp:cNvGraphicFramePr>
+            <a:graphic>
+              <a:graphicData uri="http://schemas.openxmlformats.org/drawingml/2006/picture">
+                <pic:pic>
+                  <pic:nvPicPr>
+                    <pic:cNvPr id="0" name="zoom_ruz.jpg"/>
+                    <pic:cNvPicPr/>
+                  </pic:nvPicPr>
+                  <pic:blipFill>
+                    <a:blip r:embed="rId12"/>
+                    <a:stretch>
+                      <a:fillRect/>
+                    </a:stretch>
+                  </pic:blipFill>
+                  <pic:spPr>
+                    <a:xfrm>
+                      <a:off x="0" y="0"/>
+                      <a:ext cx="5760000" cy="1533600"/>
+                    </a:xfrm>
+                    <a:prstGeom prst="rect"/>
+                  </pic:spPr>
+                </pic:pic>
+              </a:graphicData>
+            </a:graphic>
+          </wp:inline>
+        </w:drawing>
+      </w:r>
+    </w:p>
+    <w:p>
+      <w:pPr>
+        <w:jc w:val="center"/>
+      </w:pPr>
+      <w:r>
+        <w:rPr>
+          <w:b/>
+          <w:i/>
+          <w:sz w:val="18"/>
+        </w:rPr>
+        <w:t>Gambar 6.3.</w:t>
+      </w:r>
+      <w:r>
+        <w:rPr>
+          <w:b w:val="0"/>
+          <w:i/>
+          <w:sz w:val="18"/>
+        </w:rPr>
+        <w:t xml:space="preserve"> Pembesaran zona atas kanan dari empat film di atas (0/0, 1/1, 2/2, 3/3 q/q). Kategori 1: bintik sedikit dan corakan vaskular masih jelas. Kategori 2: lebih banyak, corakan sebagian samar. Kategori 3: padat, corakan tertutup.</w:t>
+      </w:r>
+    </w:p>
+    <w:p>
+      <w:pPr>
+        <w:keepNext/>
+        <w:jc w:val="center"/>
+      </w:pPr>
+      <w:r>
+        <w:drawing>
+          <wp:inline xmlns:a="http://schemas.openxmlformats.org/drawingml/2006/main" xmlns:pic="http://schemas.openxmlformats.org/drawingml/2006/picture">
+            <wp:extent cx="5760000" cy="4323840"/>
+            <wp:docPr id="5" name="Picture 5"/>
+            <wp:cNvGraphicFramePr>
+              <a:graphicFrameLocks noChangeAspect="1"/>
+            </wp:cNvGraphicFramePr>
+            <a:graphic>
+              <a:graphicData uri="http://schemas.openxmlformats.org/drawingml/2006/picture">
+                <pic:pic>
+                  <pic:nvPicPr>
+                    <pic:cNvPr id="0" name="shapes.jpg"/>
+                    <pic:cNvPicPr/>
+                  </pic:nvPicPr>
+                  <pic:blipFill>
+                    <a:blip r:embed="rId13"/>
+                    <a:stretch>
+                      <a:fillRect/>
+                    </a:stretch>
+                  </pic:blipFill>
+                  <pic:spPr>
+                    <a:xfrm>
+                      <a:off x="0" y="0"/>
+                      <a:ext cx="5760000" cy="4323840"/>
+                    </a:xfrm>
+                    <a:prstGeom prst="rect"/>
+                  </pic:spPr>
+                </pic:pic>
+              </a:graphicData>
+            </a:graphic>
+          </wp:inline>
+        </w:drawing>
+      </w:r>
+    </w:p>
+    <w:p>
+      <w:pPr>
+        <w:jc w:val="center"/>
+      </w:pPr>
+      <w:r>
+        <w:rPr>
+          <w:b/>
+          <w:i/>
+          <w:sz w:val="18"/>
+        </w:rPr>
+        <w:t>Gambar 6.4.</w:t>
+      </w:r>
+      <w:r>
+        <w:rPr>
+          <w:b w:val="0"/>
+          <w:i/>
+          <w:sz w:val="18"/>
+        </w:rPr>
+        <w:t xml:space="preserve"> Pengaruh bentuk dan ukuran pada profusion 1/1: p/p (halus), q/q, r/r (besar), s/s, t/t (ireguler), dan komposit u/u (0/0, 1/1, 2/2, 3/3). Menurut kunci resmi ILO 2022, pada film ini q/q dan r/r mengisi zona atas dan tengah, p/p mengisi keenam zona, sedangkan s/s dan t/t mengisi zona bawah (selaras dengan pola silika/batu bara untuk bulat dan pola asbes untuk ireguler). Sumber: ILO standard digital images 2022.</w:t>
+      </w:r>
+    </w:p>
+    <w:p>
+      <w:pPr>
         <w:pStyle w:val="Heading2"/>
       </w:pPr>
       <w:r>
@@ -5218,10 +5676,254 @@
     </w:p>
     <w:p>
       <w:pPr>
+        <w:keepNext/>
+        <w:jc w:val="center"/>
+      </w:pPr>
+      <w:r>
+        <w:drawing>
+          <wp:inline xmlns:a="http://schemas.openxmlformats.org/drawingml/2006/main" xmlns:pic="http://schemas.openxmlformats.org/drawingml/2006/picture">
+            <wp:extent cx="5760000" cy="2300308"/>
+            <wp:docPr id="6" name="Picture 6"/>
+            <wp:cNvGraphicFramePr>
+              <a:graphicFrameLocks noChangeAspect="1"/>
+            </wp:cNvGraphicFramePr>
+            <a:graphic>
+              <a:graphicData uri="http://schemas.openxmlformats.org/drawingml/2006/picture">
+                <pic:pic>
+                  <pic:nvPicPr>
+                    <pic:cNvPr id="0" name="large.jpg"/>
+                    <pic:cNvPicPr/>
+                  </pic:nvPicPr>
+                  <pic:blipFill>
+                    <a:blip r:embed="rId14"/>
+                    <a:stretch>
+                      <a:fillRect/>
+                    </a:stretch>
+                  </pic:blipFill>
+                  <pic:spPr>
+                    <a:xfrm>
+                      <a:off x="0" y="0"/>
+                      <a:ext cx="5760000" cy="2300308"/>
+                    </a:xfrm>
+                    <a:prstGeom prst="rect"/>
+                  </pic:spPr>
+                </pic:pic>
+              </a:graphicData>
+            </a:graphic>
+          </wp:inline>
+        </w:drawing>
+      </w:r>
+    </w:p>
+    <w:p>
+      <w:pPr>
+        <w:jc w:val="center"/>
+      </w:pPr>
+      <w:r>
+        <w:rPr>
+          <w:b/>
+          <w:i/>
+          <w:sz w:val="18"/>
+        </w:rPr>
+        <w:t>Gambar 6.5.</w:t>
+      </w:r>
+      <w:r>
+        <w:rPr>
+          <w:b w:val="0"/>
+          <w:i/>
+          <w:sz w:val="18"/>
+        </w:rPr>
+        <w:t xml:space="preserve"> Film standar opasitas besar. Kiri: kategori A (opasitas besar zona atas kanan, di atas latar opasitas kecil 2/3 q/r). Tengah: kategori B (opasitas besar di kedua zona atas, total diameter &gt;50 mm tetapi luas tidak melebihi RUZ). Kanan: kategori C (3/+ r/r, opasitas besar melebihi luas RUZ). Kunci resmi: A = 2/3 q/r simbol aa, ax. B = 2/3 q/r simbol ax, bu, di. C = 3/+ r/r simbol di, pb, id, ih (ILO 2022 Appendix C).</w:t>
+      </w:r>
+    </w:p>
+    <w:p>
+      <w:pPr>
         <w:pStyle w:val="Heading2"/>
       </w:pPr>
       <w:r>
         <w:t>6.3 Pleura</w:t>
+      </w:r>
+    </w:p>
+    <w:p>
+      <w:pPr>
+        <w:keepNext/>
+        <w:jc w:val="center"/>
+      </w:pPr>
+      <w:r>
+        <w:drawing>
+          <wp:inline xmlns:a="http://schemas.openxmlformats.org/drawingml/2006/main" xmlns:pic="http://schemas.openxmlformats.org/drawingml/2006/picture">
+            <wp:extent cx="3960000" cy="5434644"/>
+            <wp:docPr id="7" name="Picture 7"/>
+            <wp:cNvGraphicFramePr>
+              <a:graphicFrameLocks noChangeAspect="1"/>
+            </wp:cNvGraphicFramePr>
+            <a:graphic>
+              <a:graphicData uri="http://schemas.openxmlformats.org/drawingml/2006/picture">
+                <pic:pic>
+                  <pic:nvPicPr>
+                    <pic:cNvPr id="0" name="g_fig2.png"/>
+                    <pic:cNvPicPr/>
+                  </pic:nvPicPr>
+                  <pic:blipFill>
+                    <a:blip r:embed="rId15"/>
+                    <a:stretch>
+                      <a:fillRect/>
+                    </a:stretch>
+                  </pic:blipFill>
+                  <pic:spPr>
+                    <a:xfrm>
+                      <a:off x="0" y="0"/>
+                      <a:ext cx="3960000" cy="5434644"/>
+                    </a:xfrm>
+                    <a:prstGeom prst="rect"/>
+                  </pic:spPr>
+                </pic:pic>
+              </a:graphicData>
+            </a:graphic>
+          </wp:inline>
+        </w:drawing>
+      </w:r>
+    </w:p>
+    <w:p>
+      <w:pPr>
+        <w:jc w:val="center"/>
+      </w:pPr>
+      <w:r>
+        <w:rPr>
+          <w:b/>
+          <w:i/>
+          <w:sz w:val="18"/>
+        </w:rPr>
+        <w:t>Gambar 6.6.</w:t>
+      </w:r>
+      <w:r>
+        <w:rPr>
+          <w:b w:val="0"/>
+          <w:i/>
+          <w:sz w:val="18"/>
+        </w:rPr>
+        <w:t xml:space="preserve"> Kelainan pleura menurut ILO: kiri atas empat contoh plak/penebalan (1 dan 2 in-profile, 3 diafragma, 4 sudut kostofrenikus), kotak luas dan lebar, serta sudut kostofrenikus: 5 dan 6 = obliterasi (+), 7 dan 8 = masih dianggap normal (0). Kanan: lokasi kalsifikasi (dinding dada, diafragma, tempat lain). Sumber: ILO Guidelines 2022, Figure 2.</w:t>
+      </w:r>
+    </w:p>
+    <w:p>
+      <w:pPr>
+        <w:keepNext/>
+        <w:jc w:val="center"/>
+      </w:pPr>
+      <w:r>
+        <w:drawing>
+          <wp:inline xmlns:a="http://schemas.openxmlformats.org/drawingml/2006/main" xmlns:pic="http://schemas.openxmlformats.org/drawingml/2006/picture">
+            <wp:extent cx="5400000" cy="2840292"/>
+            <wp:docPr id="8" name="Picture 8"/>
+            <wp:cNvGraphicFramePr>
+              <a:graphicFrameLocks noChangeAspect="1"/>
+            </wp:cNvGraphicFramePr>
+            <a:graphic>
+              <a:graphicData uri="http://schemas.openxmlformats.org/drawingml/2006/picture">
+                <pic:pic>
+                  <pic:nvPicPr>
+                    <pic:cNvPr id="0" name="g_fig3.png"/>
+                    <pic:cNvPicPr/>
+                  </pic:nvPicPr>
+                  <pic:blipFill>
+                    <a:blip r:embed="rId16"/>
+                    <a:stretch>
+                      <a:fillRect/>
+                    </a:stretch>
+                  </pic:blipFill>
+                  <pic:spPr>
+                    <a:xfrm>
+                      <a:off x="0" y="0"/>
+                      <a:ext cx="5400000" cy="2840292"/>
+                    </a:xfrm>
+                    <a:prstGeom prst="rect"/>
+                  </pic:spPr>
+                </pic:pic>
+              </a:graphicData>
+            </a:graphic>
+          </wp:inline>
+        </w:drawing>
+      </w:r>
+    </w:p>
+    <w:p>
+      <w:pPr>
+        <w:jc w:val="center"/>
+      </w:pPr>
+      <w:r>
+        <w:rPr>
+          <w:b/>
+          <w:i/>
+          <w:sz w:val="18"/>
+        </w:rPr>
+        <w:t>Gambar 6.7.</w:t>
+      </w:r>
+      <w:r>
+        <w:rPr>
+          <w:b w:val="0"/>
+          <w:i/>
+          <w:sz w:val="18"/>
+        </w:rPr>
+        <w:t xml:space="preserve"> Cara mengukur luas (extent) plak di dinding dada: dari apeks sampai sudut kostofrenikus (CPA). A: garis tengah ½ panjang dinding dada lateral. B: satu plak in-profile dan face-on melewati setengah panjang, maka luas = 3. C: tiga plak terpisah dijumlahkan panjangnya. Luas hanya dicatat untuk plak di dinding dada, tidak untuk diafragma atau tempat lain. Sumber: ILO Guidelines 2022, Figure 3.</w:t>
+      </w:r>
+    </w:p>
+    <w:p>
+      <w:pPr>
+        <w:keepNext/>
+        <w:jc w:val="center"/>
+      </w:pPr>
+      <w:r>
+        <w:drawing>
+          <wp:inline xmlns:a="http://schemas.openxmlformats.org/drawingml/2006/main" xmlns:pic="http://schemas.openxmlformats.org/drawingml/2006/picture">
+            <wp:extent cx="5400000" cy="2700000"/>
+            <wp:docPr id="9" name="Picture 9"/>
+            <wp:cNvGraphicFramePr>
+              <a:graphicFrameLocks noChangeAspect="1"/>
+            </wp:cNvGraphicFramePr>
+            <a:graphic>
+              <a:graphicData uri="http://schemas.openxmlformats.org/drawingml/2006/picture">
+                <pic:pic>
+                  <pic:nvPicPr>
+                    <pic:cNvPr id="0" name="pleura.jpg"/>
+                    <pic:cNvPicPr/>
+                  </pic:nvPicPr>
+                  <pic:blipFill>
+                    <a:blip r:embed="rId17"/>
+                    <a:stretch>
+                      <a:fillRect/>
+                    </a:stretch>
+                  </pic:blipFill>
+                  <pic:spPr>
+                    <a:xfrm>
+                      <a:off x="0" y="0"/>
+                      <a:ext cx="5400000" cy="2700000"/>
+                    </a:xfrm>
+                    <a:prstGeom prst="rect"/>
+                  </pic:spPr>
+                </pic:pic>
+              </a:graphicData>
+            </a:graphic>
+          </wp:inline>
+        </w:drawing>
+      </w:r>
+    </w:p>
+    <w:p>
+      <w:pPr>
+        <w:jc w:val="center"/>
+      </w:pPr>
+      <w:r>
+        <w:rPr>
+          <w:b/>
+          <w:i/>
+          <w:sz w:val="18"/>
+        </w:rPr>
+        <w:t>Gambar 6.8.</w:t>
+      </w:r>
+      <w:r>
+        <w:rPr>
+          <w:b w:val="0"/>
+          <w:i/>
+          <w:sz w:val="18"/>
+        </w:rPr>
+        <w:t xml:space="preserve"> Film standar ILO untuk pleura (kiri) dan sudut kostofrenikus (kanan). Film pleura mencakup plak dan penebalan difus dengan kalsifikasi, kualitas 2 (mottle), simbol aa dan me (pertimbangkan mesotelioma). Film CP angle menentukan batas minimal penumpulan sudut yang dianggap abnormal, kualitas 2 (kontras kurang, mottle). Sumber: ILO standard digital images 2022, Appendix C hal. 27.</w:t>
       </w:r>
     </w:p>
     <w:tbl>
@@ -5638,6 +6340,67 @@
         <w:t>6.4 Simbol (29, semuanya obligatory menurut ILO Guidelines 2022)</w:t>
       </w:r>
     </w:p>
+    <w:p>
+      <w:pPr>
+        <w:keepNext/>
+        <w:jc w:val="center"/>
+      </w:pPr>
+      <w:r>
+        <w:drawing>
+          <wp:inline xmlns:a="http://schemas.openxmlformats.org/drawingml/2006/main" xmlns:pic="http://schemas.openxmlformats.org/drawingml/2006/picture">
+            <wp:extent cx="3960000" cy="5964079"/>
+            <wp:docPr id="10" name="Picture 10"/>
+            <wp:cNvGraphicFramePr>
+              <a:graphicFrameLocks noChangeAspect="1"/>
+            </wp:cNvGraphicFramePr>
+            <a:graphic>
+              <a:graphicData uri="http://schemas.openxmlformats.org/drawingml/2006/picture">
+                <pic:pic>
+                  <pic:nvPicPr>
+                    <pic:cNvPr id="0" name="g_fig4.png"/>
+                    <pic:cNvPicPr/>
+                  </pic:nvPicPr>
+                  <pic:blipFill>
+                    <a:blip r:embed="rId18"/>
+                    <a:stretch>
+                      <a:fillRect/>
+                    </a:stretch>
+                  </pic:blipFill>
+                  <pic:spPr>
+                    <a:xfrm>
+                      <a:off x="0" y="0"/>
+                      <a:ext cx="3960000" cy="5964079"/>
+                    </a:xfrm>
+                    <a:prstGeom prst="rect"/>
+                  </pic:spPr>
+                </pic:pic>
+              </a:graphicData>
+            </a:graphic>
+          </wp:inline>
+        </w:drawing>
+      </w:r>
+    </w:p>
+    <w:p>
+      <w:pPr>
+        <w:jc w:val="center"/>
+      </w:pPr>
+      <w:r>
+        <w:rPr>
+          <w:b/>
+          <w:i/>
+          <w:sz w:val="18"/>
+        </w:rPr>
+        <w:t>Gambar 6.9.</w:t>
+      </w:r>
+      <w:r>
+        <w:rPr>
+          <w:b w:val="0"/>
+          <w:i/>
+          <w:sz w:val="18"/>
+        </w:rPr>
+        <w:t xml:space="preserve"> Diagram 29 simbol ILO (aa sampai od). Tiap kotak menggambarkan bentuk khas kelainan. Dua gambar od mewakili pneumonia lobaris, aspergiloma, goiter, dan hernia hiatus. Sumber: ILO Guidelines 2022, Figure 4.</w:t>
+      </w:r>
+    </w:p>
     <w:tbl>
       <w:tblPr>
         <w:tblStyle w:val="TableGrid"/>
@@ -7838,6 +8601,2317 @@
     </w:p>
     <w:p>
       <w:pPr>
+        <w:pStyle w:val="Heading2"/>
+      </w:pPr>
+      <w:r>
+        <w:t>Panduan membaca ILO step by step</w:t>
+      </w:r>
+    </w:p>
+    <w:p>
+      <w:r>
+        <w:rPr>
+          <w:b w:val="0"/>
+          <w:i w:val="0"/>
+        </w:rPr>
+        <w:t>Gunakan bagian ini sebagai skrip belajar. Baca lembar baca dari atas ke bawah, satu kotak pada satu waktu.</w:t>
+      </w:r>
+    </w:p>
+    <w:p>
+      <w:pPr>
+        <w:keepNext/>
+        <w:jc w:val="center"/>
+      </w:pPr>
+      <w:r>
+        <w:drawing>
+          <wp:inline xmlns:a="http://schemas.openxmlformats.org/drawingml/2006/main" xmlns:pic="http://schemas.openxmlformats.org/drawingml/2006/picture">
+            <wp:extent cx="4320000" cy="6841338"/>
+            <wp:docPr id="11" name="Picture 11"/>
+            <wp:cNvGraphicFramePr>
+              <a:graphicFrameLocks noChangeAspect="1"/>
+            </wp:cNvGraphicFramePr>
+            <a:graphic>
+              <a:graphicData uri="http://schemas.openxmlformats.org/drawingml/2006/picture">
+                <pic:pic>
+                  <pic:nvPicPr>
+                    <pic:cNvPr id="0" name="form.png"/>
+                    <pic:cNvPicPr/>
+                  </pic:nvPicPr>
+                  <pic:blipFill>
+                    <a:blip r:embed="rId19"/>
+                    <a:stretch>
+                      <a:fillRect/>
+                    </a:stretch>
+                  </pic:blipFill>
+                  <pic:spPr>
+                    <a:xfrm>
+                      <a:off x="0" y="0"/>
+                      <a:ext cx="4320000" cy="6841338"/>
+                    </a:xfrm>
+                    <a:prstGeom prst="rect"/>
+                  </pic:spPr>
+                </pic:pic>
+              </a:graphicData>
+            </a:graphic>
+          </wp:inline>
+        </w:drawing>
+      </w:r>
+    </w:p>
+    <w:p>
+      <w:pPr>
+        <w:jc w:val="center"/>
+      </w:pPr>
+      <w:r>
+        <w:rPr>
+          <w:b/>
+          <w:i/>
+          <w:sz w:val="18"/>
+        </w:rPr>
+        <w:t>Gambar 7.1.</w:t>
+      </w:r>
+      <w:r>
+        <w:rPr>
+          <w:b w:val="0"/>
+          <w:i/>
+          <w:sz w:val="18"/>
+        </w:rPr>
+        <w:t xml:space="preserve"> Lembar baca ILO (Chest Radiograph Classification Form). Urutan pengisian: 1 kualitas, 2A-2C parenkim, 3A-3D pleura, 4A-4C simbol, 5 identitas pembaca. Sumber: ILO Guidelines 2022, Appendix B.</w:t>
+      </w:r>
+    </w:p>
+    <w:p>
+      <w:r>
+        <w:rPr>
+          <w:b/>
+          <w:i w:val="0"/>
+        </w:rPr>
+        <w:t>Tiga prinsip sebelum mulai:</w:t>
+      </w:r>
+    </w:p>
+    <w:p>
+      <w:pPr>
+        <w:spacing w:after="40"/>
+        <w:ind w:left="510" w:hanging="340"/>
+      </w:pPr>
+      <w:r>
+        <w:rPr>
+          <w:b w:val="0"/>
+          <w:i w:val="0"/>
+        </w:rPr>
+        <w:t xml:space="preserve">1. </w:t>
+      </w:r>
+      <w:r>
+        <w:rPr>
+          <w:b/>
+          <w:i w:val="0"/>
+        </w:rPr>
+        <w:t>Tidak ada gambaran yang patognomonik</w:t>
+      </w:r>
+      <w:r>
+        <w:rPr>
+          <w:b w:val="0"/>
+          <w:i w:val="0"/>
+        </w:rPr>
+        <w:t xml:space="preserve"> untuk pajanan debu (ILO 2022 bab 2). Baca apa yang terlihat, jangan menyimpulkan sebab di lembar baca.</w:t>
+      </w:r>
+    </w:p>
+    <w:p>
+      <w:pPr>
+        <w:spacing w:after="40"/>
+        <w:ind w:left="510" w:hanging="340"/>
+      </w:pPr>
+      <w:r>
+        <w:rPr>
+          <w:b w:val="0"/>
+          <w:i w:val="0"/>
+        </w:rPr>
+        <w:t xml:space="preserve">2. </w:t>
+      </w:r>
+      <w:r>
+        <w:rPr>
+          <w:b/>
+          <w:i w:val="0"/>
+        </w:rPr>
+        <w:t>Film standar adalah kalibrasi</w:t>
+      </w:r>
+      <w:r>
+        <w:rPr>
+          <w:b w:val="0"/>
+          <w:i w:val="0"/>
+        </w:rPr>
+        <w:t xml:space="preserve"> untuk profusion: bila tulisan dan film standar berbeda, film standar yang menang. Untuk beberapa bagian lain, film standar hanya contoh dan tulisan yang menang.</w:t>
+      </w:r>
+    </w:p>
+    <w:p>
+      <w:pPr>
+        <w:spacing w:after="40"/>
+        <w:ind w:left="510" w:hanging="340"/>
+      </w:pPr>
+      <w:r>
+        <w:rPr>
+          <w:b w:val="0"/>
+          <w:i w:val="0"/>
+        </w:rPr>
+        <w:t xml:space="preserve">3. </w:t>
+      </w:r>
+      <w:r>
+        <w:rPr>
+          <w:b/>
+          <w:i w:val="0"/>
+        </w:rPr>
+        <w:t>Baca buta</w:t>
+      </w:r>
+      <w:r>
+        <w:rPr>
+          <w:b w:val="0"/>
+          <w:i w:val="0"/>
+        </w:rPr>
+        <w:t xml:space="preserve"> terhadap identitas, status pajanan, dan hasil pembaca lain. Pasang film pasien berdampingan dengan film standar 0/0, 1/1, 2/2, 3/3 untuk bentuk yang sama.</w:t>
+      </w:r>
+    </w:p>
+    <w:tbl>
+      <w:tblPr>
+        <w:tblStyle w:val="TableGrid"/>
+        <w:tblW w:type="auto" w:w="0"/>
+        <w:tblLook w:firstColumn="1" w:firstRow="1" w:lastColumn="0" w:lastRow="0" w:noHBand="0" w:noVBand="1" w:val="04A0"/>
+      </w:tblPr>
+      <w:tblGrid>
+        <w:gridCol w:w="2493"/>
+        <w:gridCol w:w="2493"/>
+        <w:gridCol w:w="2493"/>
+        <w:gridCol w:w="2493"/>
+      </w:tblGrid>
+      <w:tr>
+        <w:trPr>
+          <w:tblHeader w:val="true"/>
+        </w:trPr>
+        <w:tc>
+          <w:tcPr>
+            <w:tcW w:type="dxa" w:w="2493"/>
+            <w:shd w:val="clear" w:color="auto" w:fill="1F3A5F"/>
+          </w:tcPr>
+          <w:p>
+            <w:r>
+              <w:rPr>
+                <w:color w:val="FFFFFF"/>
+              </w:rPr>
+            </w:r>
+            <w:r>
+              <w:rPr>
+                <w:b/>
+                <w:i w:val="0"/>
+                <w:color w:val="FFFFFF"/>
+                <w:sz w:val="20"/>
+              </w:rPr>
+              <w:t>Langkah</w:t>
+            </w:r>
+          </w:p>
+        </w:tc>
+        <w:tc>
+          <w:tcPr>
+            <w:tcW w:type="dxa" w:w="2493"/>
+            <w:shd w:val="clear" w:color="auto" w:fill="1F3A5F"/>
+          </w:tcPr>
+          <w:p>
+            <w:r>
+              <w:rPr>
+                <w:color w:val="FFFFFF"/>
+              </w:rPr>
+            </w:r>
+            <w:r>
+              <w:rPr>
+                <w:b/>
+                <w:i w:val="0"/>
+                <w:color w:val="FFFFFF"/>
+                <w:sz w:val="20"/>
+              </w:rPr>
+              <w:t>Apa yang dilakukan</w:t>
+            </w:r>
+          </w:p>
+        </w:tc>
+        <w:tc>
+          <w:tcPr>
+            <w:tcW w:type="dxa" w:w="2493"/>
+            <w:shd w:val="clear" w:color="auto" w:fill="1F3A5F"/>
+          </w:tcPr>
+          <w:p>
+            <w:r>
+              <w:rPr>
+                <w:color w:val="FFFFFF"/>
+              </w:rPr>
+            </w:r>
+            <w:r>
+              <w:rPr>
+                <w:b/>
+                <w:i w:val="0"/>
+                <w:color w:val="FFFFFF"/>
+                <w:sz w:val="20"/>
+              </w:rPr>
+              <w:t>Aturan keputusan</w:t>
+            </w:r>
+          </w:p>
+        </w:tc>
+        <w:tc>
+          <w:tcPr>
+            <w:tcW w:type="dxa" w:w="2493"/>
+            <w:shd w:val="clear" w:color="auto" w:fill="1F3A5F"/>
+          </w:tcPr>
+          <w:p>
+            <w:r>
+              <w:rPr>
+                <w:color w:val="FFFFFF"/>
+              </w:rPr>
+            </w:r>
+            <w:r>
+              <w:rPr>
+                <w:b/>
+                <w:i w:val="0"/>
+                <w:color w:val="FFFFFF"/>
+                <w:sz w:val="20"/>
+              </w:rPr>
+              <w:t>Kesalahan yang sering terjadi</w:t>
+            </w:r>
+          </w:p>
+        </w:tc>
+      </w:tr>
+      <w:tr>
+        <w:tc>
+          <w:tcPr>
+            <w:tcW w:type="dxa" w:w="2493"/>
+          </w:tcPr>
+          <w:p>
+            <w:r/>
+            <w:r>
+              <w:rPr>
+                <w:b/>
+                <w:i w:val="0"/>
+                <w:sz w:val="20"/>
+              </w:rPr>
+              <w:t>1. Kualitas</w:t>
+            </w:r>
+            <w:r>
+              <w:rPr>
+                <w:b w:val="0"/>
+                <w:i w:val="0"/>
+                <w:sz w:val="20"/>
+              </w:rPr>
+              <w:t xml:space="preserve"> (kotak 1)</w:t>
+            </w:r>
+          </w:p>
+        </w:tc>
+        <w:tc>
+          <w:tcPr>
+            <w:tcW w:type="dxa" w:w="2493"/>
+          </w:tcPr>
+          <w:p>
+            <w:r/>
+            <w:r>
+              <w:rPr>
+                <w:b w:val="0"/>
+                <w:i w:val="0"/>
+                <w:sz w:val="20"/>
+              </w:rPr>
+              <w:t>Lima cek: inspirasi (iga posterior ke-10), rotasi, skapula, penetrasi/kontras, artefak</w:t>
+            </w:r>
+          </w:p>
+        </w:tc>
+        <w:tc>
+          <w:tcPr>
+            <w:tcW w:type="dxa" w:w="2493"/>
+          </w:tcPr>
+          <w:p>
+            <w:r/>
+            <w:r>
+              <w:rPr>
+                <w:b w:val="0"/>
+                <w:i w:val="0"/>
+                <w:sz w:val="20"/>
+              </w:rPr>
+              <w:t xml:space="preserve">Grade 1-4. Bukan grade 1: centang alasan dan </w:t>
+            </w:r>
+            <w:r>
+              <w:rPr>
+                <w:b/>
+                <w:i w:val="0"/>
+                <w:sz w:val="20"/>
+              </w:rPr>
+              <w:t>tulis komentar sebelum melanjutkan</w:t>
+            </w:r>
+            <w:r>
+              <w:rPr>
+                <w:b w:val="0"/>
+                <w:i w:val="0"/>
+                <w:sz w:val="20"/>
+              </w:rPr>
+              <w:t xml:space="preserve">. </w:t>
+            </w:r>
+            <w:r>
+              <w:rPr>
+                <w:b/>
+                <w:i w:val="0"/>
+                <w:sz w:val="20"/>
+              </w:rPr>
+              <w:t>Grade 4: berhenti, minta foto ulang</w:t>
+            </w:r>
+          </w:p>
+        </w:tc>
+        <w:tc>
+          <w:tcPr>
+            <w:tcW w:type="dxa" w:w="2493"/>
+          </w:tcPr>
+          <w:p>
+            <w:r/>
+            <w:r>
+              <w:rPr>
+                <w:b w:val="0"/>
+                <w:i w:val="0"/>
+                <w:sz w:val="20"/>
+              </w:rPr>
+              <w:t>Langsung membaca parenkim tanpa menilai kualitas</w:t>
+            </w:r>
+          </w:p>
+        </w:tc>
+      </w:tr>
+      <w:tr>
+        <w:tc>
+          <w:tcPr>
+            <w:tcW w:type="dxa" w:w="2493"/>
+          </w:tcPr>
+          <w:p>
+            <w:r/>
+            <w:r>
+              <w:rPr>
+                <w:b/>
+                <w:i w:val="0"/>
+                <w:sz w:val="20"/>
+              </w:rPr>
+              <w:t>2. Parenkim ada?</w:t>
+            </w:r>
+            <w:r>
+              <w:rPr>
+                <w:b w:val="0"/>
+                <w:i w:val="0"/>
+                <w:sz w:val="20"/>
+              </w:rPr>
+              <w:t xml:space="preserve"> (2A)</w:t>
+            </w:r>
+          </w:p>
+        </w:tc>
+        <w:tc>
+          <w:tcPr>
+            <w:tcW w:type="dxa" w:w="2493"/>
+          </w:tcPr>
+          <w:p>
+            <w:r/>
+            <w:r>
+              <w:rPr>
+                <w:b w:val="0"/>
+                <w:i w:val="0"/>
+                <w:sz w:val="20"/>
+              </w:rPr>
+              <w:t>Pindai sistematis kanan dan kiri, atas ke bawah, termasuk di balik jantung dan di atas diafragma</w:t>
+            </w:r>
+          </w:p>
+        </w:tc>
+        <w:tc>
+          <w:tcPr>
+            <w:tcW w:type="dxa" w:w="2493"/>
+          </w:tcPr>
+          <w:p>
+            <w:r/>
+            <w:r>
+              <w:rPr>
+                <w:b w:val="0"/>
+                <w:i w:val="0"/>
+                <w:sz w:val="20"/>
+              </w:rPr>
+              <w:t>Ada kelainan yang konsisten pneumokoniosis = Yes, lanjut 2B dan 2C. Tidak ada = No, ke 3A, profusion dicatat 0/0 (atau 0/- bila benar-benar bersih)</w:t>
+            </w:r>
+          </w:p>
+        </w:tc>
+        <w:tc>
+          <w:tcPr>
+            <w:tcW w:type="dxa" w:w="2493"/>
+          </w:tcPr>
+          <w:p>
+            <w:r/>
+            <w:r>
+              <w:rPr>
+                <w:b w:val="0"/>
+                <w:i w:val="0"/>
+                <w:sz w:val="20"/>
+              </w:rPr>
+              <w:t>Menyebut "normal" tanpa mengisi profusion</w:t>
+            </w:r>
+          </w:p>
+        </w:tc>
+      </w:tr>
+      <w:tr>
+        <w:tc>
+          <w:tcPr>
+            <w:tcW w:type="dxa" w:w="2493"/>
+          </w:tcPr>
+          <w:p>
+            <w:r/>
+            <w:r>
+              <w:rPr>
+                <w:b/>
+                <w:i w:val="0"/>
+                <w:sz w:val="20"/>
+              </w:rPr>
+              <w:t>3. Zona</w:t>
+            </w:r>
+            <w:r>
+              <w:rPr>
+                <w:b w:val="0"/>
+                <w:i w:val="0"/>
+                <w:sz w:val="20"/>
+              </w:rPr>
+              <w:t xml:space="preserve"> (2B-b)</w:t>
+            </w:r>
+          </w:p>
+        </w:tc>
+        <w:tc>
+          <w:tcPr>
+            <w:tcW w:type="dxa" w:w="2493"/>
+          </w:tcPr>
+          <w:p>
+            <w:r/>
+            <w:r>
+              <w:rPr>
+                <w:b w:val="0"/>
+                <w:i w:val="0"/>
+                <w:sz w:val="20"/>
+              </w:rPr>
+              <w:t>Bagi tiap paru menjadi tiga zona dengan garis horizontal pada ±⅓ dan ⅔ jarak vertikal apeks sampai kubah diafragma (lihat Gambar 7.2)</w:t>
+            </w:r>
+          </w:p>
+        </w:tc>
+        <w:tc>
+          <w:tcPr>
+            <w:tcW w:type="dxa" w:w="2493"/>
+          </w:tcPr>
+          <w:p>
+            <w:r/>
+            <w:r>
+              <w:rPr>
+                <w:b w:val="0"/>
+                <w:i w:val="0"/>
+                <w:sz w:val="20"/>
+              </w:rPr>
+              <w:t>Centang zona yang berisi opasitas kecil, dari enam kotak (RU, RM, RL, LU, LM, LL)</w:t>
+            </w:r>
+          </w:p>
+        </w:tc>
+        <w:tc>
+          <w:tcPr>
+            <w:tcW w:type="dxa" w:w="2493"/>
+          </w:tcPr>
+          <w:p>
+            <w:r/>
+            <w:r>
+              <w:rPr>
+                <w:b w:val="0"/>
+                <w:i w:val="0"/>
+                <w:sz w:val="20"/>
+              </w:rPr>
+              <w:t>Menghitung zona berdasarkan iga, bukan jarak apeks-diafragma</w:t>
+            </w:r>
+          </w:p>
+        </w:tc>
+      </w:tr>
+      <w:tr>
+        <w:tc>
+          <w:tcPr>
+            <w:tcW w:type="dxa" w:w="2493"/>
+          </w:tcPr>
+          <w:p>
+            <w:r/>
+            <w:r>
+              <w:rPr>
+                <w:b/>
+                <w:i w:val="0"/>
+                <w:sz w:val="20"/>
+              </w:rPr>
+              <w:t>4. Bentuk dan ukuran</w:t>
+            </w:r>
+            <w:r>
+              <w:rPr>
+                <w:b w:val="0"/>
+                <w:i w:val="0"/>
+                <w:sz w:val="20"/>
+              </w:rPr>
+              <w:t xml:space="preserve"> (2B-a)</w:t>
+            </w:r>
+          </w:p>
+        </w:tc>
+        <w:tc>
+          <w:tcPr>
+            <w:tcW w:type="dxa" w:w="2493"/>
+          </w:tcPr>
+          <w:p>
+            <w:r/>
+            <w:r>
+              <w:rPr>
+                <w:b w:val="0"/>
+                <w:i w:val="0"/>
+                <w:sz w:val="20"/>
+              </w:rPr>
+              <w:t>Tentukan opasitas dominan (primer) dan opasitas kedua yang signifikan (sekunder). Bulat: p &lt;1,5, q 1,5-3, r 3-10 mm. Ireguler: s, t, u</w:t>
+            </w:r>
+          </w:p>
+        </w:tc>
+        <w:tc>
+          <w:tcPr>
+            <w:tcW w:type="dxa" w:w="2493"/>
+          </w:tcPr>
+          <w:p>
+            <w:r/>
+            <w:r>
+              <w:rPr>
+                <w:b w:val="0"/>
+                <w:i w:val="0"/>
+                <w:sz w:val="20"/>
+              </w:rPr>
+              <w:t>Dua huruf, mis. q/q bila hampir semua q, q/t bila dominan q dengan campuran t</w:t>
+            </w:r>
+          </w:p>
+        </w:tc>
+        <w:tc>
+          <w:tcPr>
+            <w:tcW w:type="dxa" w:w="2493"/>
+          </w:tcPr>
+          <w:p>
+            <w:r/>
+            <w:r>
+              <w:rPr>
+                <w:b w:val="0"/>
+                <w:i w:val="0"/>
+                <w:sz w:val="20"/>
+              </w:rPr>
+              <w:t>Menulis satu huruf saja</w:t>
+            </w:r>
+          </w:p>
+        </w:tc>
+      </w:tr>
+      <w:tr>
+        <w:tc>
+          <w:tcPr>
+            <w:tcW w:type="dxa" w:w="2493"/>
+          </w:tcPr>
+          <w:p>
+            <w:r/>
+            <w:r>
+              <w:rPr>
+                <w:b/>
+                <w:i w:val="0"/>
+                <w:sz w:val="20"/>
+              </w:rPr>
+              <w:t>5. Profusion</w:t>
+            </w:r>
+            <w:r>
+              <w:rPr>
+                <w:b w:val="0"/>
+                <w:i w:val="0"/>
+                <w:sz w:val="20"/>
+              </w:rPr>
+              <w:t xml:space="preserve"> (2B-c)</w:t>
+            </w:r>
+          </w:p>
+        </w:tc>
+        <w:tc>
+          <w:tcPr>
+            <w:tcW w:type="dxa" w:w="2493"/>
+          </w:tcPr>
+          <w:p>
+            <w:r/>
+            <w:r>
+              <w:rPr>
+                <w:b w:val="0"/>
+                <w:i w:val="0"/>
+                <w:sz w:val="20"/>
+              </w:rPr>
+              <w:t>Bandingkan konsentrasi opasitas rata-rata di zona terlibat dengan film standar 0/0, 1/1, 2/2, 3/3</w:t>
+            </w:r>
+          </w:p>
+        </w:tc>
+        <w:tc>
+          <w:tcPr>
+            <w:tcW w:type="dxa" w:w="2493"/>
+          </w:tcPr>
+          <w:p>
+            <w:r/>
+            <w:r>
+              <w:rPr>
+                <w:b w:val="0"/>
+                <w:i w:val="0"/>
+                <w:sz w:val="20"/>
+              </w:rPr>
+              <w:t>Pilih standar tengah yang paling mirip. Angka kedua = kategori alternatif yang dipertimbangkan serius. Tidak ada alternatif = angka sama (2/2). Lebih padat dari 3/3 = 3/+. Zona dengan profusion jauh lebih rendah diabaikan (lihat catatan di bawah tabel)</w:t>
+            </w:r>
+          </w:p>
+        </w:tc>
+        <w:tc>
+          <w:tcPr>
+            <w:tcW w:type="dxa" w:w="2493"/>
+          </w:tcPr>
+          <w:p>
+            <w:r/>
+            <w:r>
+              <w:rPr>
+                <w:b w:val="0"/>
+                <w:i w:val="0"/>
+                <w:sz w:val="20"/>
+              </w:rPr>
+              <w:t>Mengambil profusion dari satu zona terpadat saja, atau menaikkan skor karena ada plak pleura</w:t>
+            </w:r>
+          </w:p>
+        </w:tc>
+      </w:tr>
+      <w:tr>
+        <w:tc>
+          <w:tcPr>
+            <w:tcW w:type="dxa" w:w="2493"/>
+          </w:tcPr>
+          <w:p>
+            <w:r/>
+            <w:r>
+              <w:rPr>
+                <w:b/>
+                <w:i w:val="0"/>
+                <w:sz w:val="20"/>
+              </w:rPr>
+              <w:t>6. Opasitas besar</w:t>
+            </w:r>
+            <w:r>
+              <w:rPr>
+                <w:b w:val="0"/>
+                <w:i w:val="0"/>
+                <w:sz w:val="20"/>
+              </w:rPr>
+              <w:t xml:space="preserve"> (2C)</w:t>
+            </w:r>
+          </w:p>
+        </w:tc>
+        <w:tc>
+          <w:tcPr>
+            <w:tcW w:type="dxa" w:w="2493"/>
+          </w:tcPr>
+          <w:p>
+            <w:r/>
+            <w:r>
+              <w:rPr>
+                <w:b w:val="0"/>
+                <w:i w:val="0"/>
+                <w:sz w:val="20"/>
+              </w:rPr>
+              <w:t>Ukur diameter terpanjang opasitas &gt;10 mm</w:t>
+            </w:r>
+          </w:p>
+        </w:tc>
+        <w:tc>
+          <w:tcPr>
+            <w:tcW w:type="dxa" w:w="2493"/>
+          </w:tcPr>
+          <w:p>
+            <w:r/>
+            <w:r>
+              <w:rPr>
+                <w:b w:val="0"/>
+                <w:i w:val="0"/>
+                <w:sz w:val="20"/>
+              </w:rPr>
+              <w:t xml:space="preserve">0 tidak ada. </w:t>
+            </w:r>
+            <w:r>
+              <w:rPr>
+                <w:b/>
+                <w:i w:val="0"/>
+                <w:sz w:val="20"/>
+              </w:rPr>
+              <w:t>A</w:t>
+            </w:r>
+            <w:r>
+              <w:rPr>
+                <w:b w:val="0"/>
+                <w:i w:val="0"/>
+                <w:sz w:val="20"/>
+              </w:rPr>
+              <w:t xml:space="preserve"> satu 10-50 mm atau beberapa dengan jumlah ≤50 mm. </w:t>
+            </w:r>
+            <w:r>
+              <w:rPr>
+                <w:b/>
+                <w:i w:val="0"/>
+                <w:sz w:val="20"/>
+              </w:rPr>
+              <w:t>B</w:t>
+            </w:r>
+            <w:r>
+              <w:rPr>
+                <w:b w:val="0"/>
+                <w:i w:val="0"/>
+                <w:sz w:val="20"/>
+              </w:rPr>
+              <w:t xml:space="preserve"> jumlah &gt;50 mm, luas ≤ RUZ. </w:t>
+            </w:r>
+            <w:r>
+              <w:rPr>
+                <w:b/>
+                <w:i w:val="0"/>
+                <w:sz w:val="20"/>
+              </w:rPr>
+              <w:t>C</w:t>
+            </w:r>
+            <w:r>
+              <w:rPr>
+                <w:b w:val="0"/>
+                <w:i w:val="0"/>
+                <w:sz w:val="20"/>
+              </w:rPr>
+              <w:t xml:space="preserve"> luas &gt; RUZ</w:t>
+            </w:r>
+          </w:p>
+        </w:tc>
+        <w:tc>
+          <w:tcPr>
+            <w:tcW w:type="dxa" w:w="2493"/>
+          </w:tcPr>
+          <w:p>
+            <w:r/>
+            <w:r>
+              <w:rPr>
+                <w:b w:val="0"/>
+                <w:i w:val="0"/>
+                <w:sz w:val="20"/>
+              </w:rPr>
+              <w:t>Menyebut B bila luas sebenarnya melebihi RUZ</w:t>
+            </w:r>
+          </w:p>
+        </w:tc>
+      </w:tr>
+      <w:tr>
+        <w:tc>
+          <w:tcPr>
+            <w:tcW w:type="dxa" w:w="2493"/>
+          </w:tcPr>
+          <w:p>
+            <w:r/>
+            <w:r>
+              <w:rPr>
+                <w:b/>
+                <w:i w:val="0"/>
+                <w:sz w:val="20"/>
+              </w:rPr>
+              <w:t>7. Pleura</w:t>
+            </w:r>
+            <w:r>
+              <w:rPr>
+                <w:b w:val="0"/>
+                <w:i w:val="0"/>
+                <w:sz w:val="20"/>
+              </w:rPr>
+              <w:t xml:space="preserve"> (3A-3D)</w:t>
+            </w:r>
+          </w:p>
+        </w:tc>
+        <w:tc>
+          <w:tcPr>
+            <w:tcW w:type="dxa" w:w="2493"/>
+          </w:tcPr>
+          <w:p>
+            <w:r/>
+            <w:r>
+              <w:rPr>
+                <w:b/>
+                <w:i w:val="0"/>
+                <w:sz w:val="20"/>
+              </w:rPr>
+              <w:t>3B plak:</w:t>
+            </w:r>
+            <w:r>
+              <w:rPr>
+                <w:b w:val="0"/>
+                <w:i w:val="0"/>
+                <w:sz w:val="20"/>
+              </w:rPr>
+              <w:t xml:space="preserve"> lokasi (in-profile, face-on, diafragma, tempat lain), kalsifikasi, luas 1-3 (hanya dinding dada), lebar a-c (hanya in-profile, minimal 3 mm). </w:t>
+            </w:r>
+            <w:r>
+              <w:rPr>
+                <w:b/>
+                <w:i w:val="0"/>
+                <w:sz w:val="20"/>
+              </w:rPr>
+              <w:t>3C:</w:t>
+            </w:r>
+            <w:r>
+              <w:rPr>
+                <w:b w:val="0"/>
+                <w:i w:val="0"/>
+                <w:sz w:val="20"/>
+              </w:rPr>
+              <w:t xml:space="preserve"> obliterasi sudut kostofrenikus kanan/kiri, patokan film standar CP angle. </w:t>
+            </w:r>
+            <w:r>
+              <w:rPr>
+                <w:b/>
+                <w:i w:val="0"/>
+                <w:sz w:val="20"/>
+              </w:rPr>
+              <w:t>3D:</w:t>
+            </w:r>
+            <w:r>
+              <w:rPr>
+                <w:b w:val="0"/>
+                <w:i w:val="0"/>
+                <w:sz w:val="20"/>
+              </w:rPr>
+              <w:t xml:space="preserve"> penebalan difus</w:t>
+            </w:r>
+          </w:p>
+        </w:tc>
+        <w:tc>
+          <w:tcPr>
+            <w:tcW w:type="dxa" w:w="2493"/>
+          </w:tcPr>
+          <w:p>
+            <w:r/>
+            <w:r>
+              <w:rPr>
+                <w:b w:val="0"/>
+                <w:i w:val="0"/>
+                <w:sz w:val="20"/>
+              </w:rPr>
+              <w:t xml:space="preserve">Penebalan difus </w:t>
+            </w:r>
+            <w:r>
+              <w:rPr>
+                <w:b/>
+                <w:i w:val="0"/>
+                <w:sz w:val="20"/>
+              </w:rPr>
+              <w:t>hanya dicatat bila bersambung dengan obliterasi sudut kostofrenikus</w:t>
+            </w:r>
+            <w:r>
+              <w:rPr>
+                <w:b w:val="0"/>
+                <w:i w:val="0"/>
+                <w:sz w:val="20"/>
+              </w:rPr>
+              <w:t>. Plak dan penebalan tidak mengubah profusion</w:t>
+            </w:r>
+          </w:p>
+        </w:tc>
+        <w:tc>
+          <w:tcPr>
+            <w:tcW w:type="dxa" w:w="2493"/>
+          </w:tcPr>
+          <w:p>
+            <w:r/>
+            <w:r>
+              <w:rPr>
+                <w:b w:val="0"/>
+                <w:i w:val="0"/>
+                <w:sz w:val="20"/>
+              </w:rPr>
+              <w:t>Mencatat penebalan apeks saja sebagai penebalan difus</w:t>
+            </w:r>
+          </w:p>
+        </w:tc>
+      </w:tr>
+      <w:tr>
+        <w:tc>
+          <w:tcPr>
+            <w:tcW w:type="dxa" w:w="2493"/>
+          </w:tcPr>
+          <w:p>
+            <w:r/>
+            <w:r>
+              <w:rPr>
+                <w:b/>
+                <w:i w:val="0"/>
+                <w:sz w:val="20"/>
+              </w:rPr>
+              <w:t>8. Simbol</w:t>
+            </w:r>
+            <w:r>
+              <w:rPr>
+                <w:b w:val="0"/>
+                <w:i w:val="0"/>
+                <w:sz w:val="20"/>
+              </w:rPr>
+              <w:t xml:space="preserve"> (4A-4B)</w:t>
+            </w:r>
+          </w:p>
+        </w:tc>
+        <w:tc>
+          <w:tcPr>
+            <w:tcW w:type="dxa" w:w="2493"/>
+          </w:tcPr>
+          <w:p>
+            <w:r/>
+            <w:r>
+              <w:rPr>
+                <w:b w:val="0"/>
+                <w:i w:val="0"/>
+                <w:sz w:val="20"/>
+              </w:rPr>
+              <w:t>Centang setiap simbol yang berlaku dari 29</w:t>
+            </w:r>
+          </w:p>
+        </w:tc>
+        <w:tc>
+          <w:tcPr>
+            <w:tcW w:type="dxa" w:w="2493"/>
+          </w:tcPr>
+          <w:p>
+            <w:r/>
+            <w:r>
+              <w:rPr>
+                <w:b w:val="0"/>
+                <w:i w:val="0"/>
+                <w:sz w:val="20"/>
+              </w:rPr>
+              <w:t xml:space="preserve">Semua simbol obligatory. </w:t>
+            </w:r>
+            <w:r>
+              <w:rPr>
+                <w:b/>
+                <w:i w:val="0"/>
+                <w:sz w:val="20"/>
+              </w:rPr>
+              <w:t>od wajib komentar</w:t>
+            </w:r>
+          </w:p>
+        </w:tc>
+        <w:tc>
+          <w:tcPr>
+            <w:tcW w:type="dxa" w:w="2493"/>
+          </w:tcPr>
+          <w:p>
+            <w:r/>
+            <w:r>
+              <w:rPr>
+                <w:b w:val="0"/>
+                <w:i w:val="0"/>
+                <w:sz w:val="20"/>
+              </w:rPr>
+              <w:t>Lupa es, ax, tb, cv, em yang menentukan rekomendasi</w:t>
+            </w:r>
+          </w:p>
+        </w:tc>
+      </w:tr>
+      <w:tr>
+        <w:tc>
+          <w:tcPr>
+            <w:tcW w:type="dxa" w:w="2493"/>
+          </w:tcPr>
+          <w:p>
+            <w:r/>
+            <w:r>
+              <w:rPr>
+                <w:b/>
+                <w:i w:val="0"/>
+                <w:sz w:val="20"/>
+              </w:rPr>
+              <w:t>9. Komentar dan identitas</w:t>
+            </w:r>
+            <w:r>
+              <w:rPr>
+                <w:b w:val="0"/>
+                <w:i w:val="0"/>
+                <w:sz w:val="20"/>
+              </w:rPr>
+              <w:t xml:space="preserve"> (4C, 5)</w:t>
+            </w:r>
+          </w:p>
+        </w:tc>
+        <w:tc>
+          <w:tcPr>
+            <w:tcW w:type="dxa" w:w="2493"/>
+          </w:tcPr>
+          <w:p>
+            <w:r/>
+            <w:r>
+              <w:rPr>
+                <w:b w:val="0"/>
+                <w:i w:val="0"/>
+                <w:sz w:val="20"/>
+              </w:rPr>
+              <w:t>Tulis komentar untuk od, kelainan yang bukan akibat debu, kualitas bukan grade 1. Isi 4C: perlu ke dokter pribadi?</w:t>
+            </w:r>
+          </w:p>
+        </w:tc>
+        <w:tc>
+          <w:tcPr>
+            <w:tcW w:type="dxa" w:w="2493"/>
+          </w:tcPr>
+          <w:p>
+            <w:r/>
+            <w:r>
+              <w:rPr>
+                <w:b w:val="0"/>
+                <w:i w:val="0"/>
+                <w:sz w:val="20"/>
+              </w:rPr>
+              <w:t>Isi ID pembaca, tanggal, tanda tangan</w:t>
+            </w:r>
+          </w:p>
+        </w:tc>
+        <w:tc>
+          <w:tcPr>
+            <w:tcW w:type="dxa" w:w="2493"/>
+          </w:tcPr>
+          <w:p>
+            <w:r/>
+            <w:r>
+              <w:rPr>
+                <w:b w:val="0"/>
+                <w:i w:val="0"/>
+                <w:sz w:val="20"/>
+              </w:rPr>
+              <w:t>Tidak menulis alasan kualitas</w:t>
+            </w:r>
+          </w:p>
+        </w:tc>
+      </w:tr>
+      <w:tr>
+        <w:tc>
+          <w:tcPr>
+            <w:tcW w:type="dxa" w:w="2493"/>
+          </w:tcPr>
+          <w:p>
+            <w:r/>
+            <w:r>
+              <w:rPr>
+                <w:b/>
+                <w:i w:val="0"/>
+                <w:sz w:val="20"/>
+              </w:rPr>
+              <w:t>10. Kesan dan rekomendasi</w:t>
+            </w:r>
+          </w:p>
+        </w:tc>
+        <w:tc>
+          <w:tcPr>
+            <w:tcW w:type="dxa" w:w="2493"/>
+          </w:tcPr>
+          <w:p>
+            <w:r/>
+            <w:r>
+              <w:rPr>
+                <w:b w:val="0"/>
+                <w:i w:val="0"/>
+                <w:sz w:val="20"/>
+              </w:rPr>
+              <w:t>Terjemahkan lembar baca menjadi kalimat klinis</w:t>
+            </w:r>
+          </w:p>
+        </w:tc>
+        <w:tc>
+          <w:tcPr>
+            <w:tcW w:type="dxa" w:w="2493"/>
+          </w:tcPr>
+          <w:p>
+            <w:r/>
+            <w:r>
+              <w:rPr>
+                <w:b w:val="0"/>
+                <w:i w:val="0"/>
+                <w:sz w:val="20"/>
+              </w:rPr>
+              <w:t>Simple (hanya opasitas kecil) atau complicated (A/B/C). Pleura terpisah. Rekomendasi: HRCT, spirometri, skrining TB, 7 langkah PAK, rujuk, FTW</w:t>
+            </w:r>
+          </w:p>
+        </w:tc>
+        <w:tc>
+          <w:tcPr>
+            <w:tcW w:type="dxa" w:w="2493"/>
+          </w:tcPr>
+          <w:p>
+            <w:r/>
+            <w:r>
+              <w:rPr>
+                <w:b w:val="0"/>
+                <w:i w:val="0"/>
+                <w:sz w:val="20"/>
+              </w:rPr>
+              <w:t>Menyebut diagnosis PAK dari lembar baca saja</w:t>
+            </w:r>
+          </w:p>
+        </w:tc>
+      </w:tr>
+    </w:tbl>
+    <w:p>
+      <w:pPr>
+        <w:spacing w:after="40"/>
+      </w:pPr>
+    </w:p>
+    <w:p>
+      <w:r>
+        <w:rPr>
+          <w:b/>
+          <w:i w:val="0"/>
+        </w:rPr>
+        <w:t>Catatan aturan zona pada profusion (ILO 2022 bab 3.2):</w:t>
+      </w:r>
+      <w:r>
+        <w:rPr>
+          <w:b w:val="0"/>
+          <w:i w:val="0"/>
+        </w:rPr>
+        <w:t xml:space="preserve"> profusion keseluruhan adalah rata-rata dari zona yang terlibat. Bila ada perbedaan bermakna (tiga subkategori atau lebih, yaitu ada dua subkategori di antara zona terendah dan tertinggi), zona dengan profusion jauh lebih rendah diabaikan saat menentukan profusion keseluruhan, tetapi zonanya tetap dicentang. Contoh resmi: zona dengan profusion 1/1, 1/2, 2/1, 2/2: ada dua subkategori (1/2 dan 2/1) di antara 1/1 dan 2/2, maka zona 1/1 diabaikan dan profusion keseluruhan ditentukan dari 1/2, 2/1, 2/2. Contoh kedua: 2/1, 2/2, 2/3 (hanya satu subkategori di antara 2/1 dan 2/3): semua zona dipakai.</w:t>
+      </w:r>
+    </w:p>
+    <w:p>
+      <w:pPr>
+        <w:keepNext/>
+        <w:jc w:val="center"/>
+      </w:pPr>
+      <w:r>
+        <w:drawing>
+          <wp:inline xmlns:a="http://schemas.openxmlformats.org/drawingml/2006/main" xmlns:pic="http://schemas.openxmlformats.org/drawingml/2006/picture">
+            <wp:extent cx="3240000" cy="3240000"/>
+            <wp:docPr id="12" name="Picture 12"/>
+            <wp:cNvGraphicFramePr>
+              <a:graphicFrameLocks noChangeAspect="1"/>
+            </wp:cNvGraphicFramePr>
+            <a:graphic>
+              <a:graphicData uri="http://schemas.openxmlformats.org/drawingml/2006/picture">
+                <pic:pic>
+                  <pic:nvPicPr>
+                    <pic:cNvPr id="0" name="zones.jpg"/>
+                    <pic:cNvPicPr/>
+                  </pic:nvPicPr>
+                  <pic:blipFill>
+                    <a:blip r:embed="rId20"/>
+                    <a:stretch>
+                      <a:fillRect/>
+                    </a:stretch>
+                  </pic:blipFill>
+                  <pic:spPr>
+                    <a:xfrm>
+                      <a:off x="0" y="0"/>
+                      <a:ext cx="3240000" cy="3240000"/>
+                    </a:xfrm>
+                    <a:prstGeom prst="rect"/>
+                  </pic:spPr>
+                </pic:pic>
+              </a:graphicData>
+            </a:graphic>
+          </wp:inline>
+        </w:drawing>
+      </w:r>
+    </w:p>
+    <w:p>
+      <w:pPr>
+        <w:jc w:val="center"/>
+      </w:pPr>
+      <w:r>
+        <w:rPr>
+          <w:b/>
+          <w:i/>
+          <w:sz w:val="18"/>
+        </w:rPr>
+        <w:t>Gambar 7.2.</w:t>
+      </w:r>
+      <w:r>
+        <w:rPr>
+          <w:b w:val="0"/>
+          <w:i/>
+          <w:sz w:val="18"/>
+        </w:rPr>
+        <w:t xml:space="preserve"> Ilustrasi pembagian enam zona pada film standar 2/2 q/q. Garis merah = apeks dan kubah diafragma. Garis kuning putus-putus = batas ⅓ dan ⅔ jarak vertikal. Garis biru = garis tengah. Posisi garis adalah perkiraan untuk belajar, bukan ukuran resmi.</w:t>
+      </w:r>
+    </w:p>
+    <w:p>
+      <w:pPr>
+        <w:pStyle w:val="Heading3"/>
+      </w:pPr>
+      <w:r>
+        <w:t>Latihan terpandu 1: film profusion 2/2 q/q</w:t>
+      </w:r>
+    </w:p>
+    <w:p>
+      <w:r>
+        <w:rPr>
+          <w:b w:val="0"/>
+          <w:i w:val="0"/>
+        </w:rPr>
+        <w:t>Pakai film pada Gambar 7.2 (tutup label ILO di bagian bawah film lebih dulu, lalu cocokkan dengan kunci).</w:t>
+      </w:r>
+    </w:p>
+    <w:tbl>
+      <w:tblPr>
+        <w:tblStyle w:val="TableGrid"/>
+        <w:tblW w:type="auto" w:w="0"/>
+        <w:tblLook w:firstColumn="1" w:firstRow="1" w:lastColumn="0" w:lastRow="0" w:noHBand="0" w:noVBand="1" w:val="04A0"/>
+      </w:tblPr>
+      <w:tblGrid>
+        <w:gridCol w:w="4986"/>
+        <w:gridCol w:w="4986"/>
+      </w:tblGrid>
+      <w:tr>
+        <w:trPr>
+          <w:tblHeader w:val="true"/>
+        </w:trPr>
+        <w:tc>
+          <w:tcPr>
+            <w:tcW w:type="dxa" w:w="4986"/>
+            <w:shd w:val="clear" w:color="auto" w:fill="1F3A5F"/>
+          </w:tcPr>
+          <w:p>
+            <w:r>
+              <w:rPr>
+                <w:color w:val="FFFFFF"/>
+              </w:rPr>
+            </w:r>
+            <w:r>
+              <w:rPr>
+                <w:b/>
+                <w:i w:val="0"/>
+                <w:color w:val="FFFFFF"/>
+                <w:sz w:val="20"/>
+              </w:rPr>
+              <w:t>Langkah</w:t>
+            </w:r>
+          </w:p>
+        </w:tc>
+        <w:tc>
+          <w:tcPr>
+            <w:tcW w:type="dxa" w:w="4986"/>
+            <w:shd w:val="clear" w:color="auto" w:fill="1F3A5F"/>
+          </w:tcPr>
+          <w:p>
+            <w:r>
+              <w:rPr>
+                <w:color w:val="FFFFFF"/>
+              </w:rPr>
+            </w:r>
+            <w:r>
+              <w:rPr>
+                <w:b/>
+                <w:i w:val="0"/>
+                <w:color w:val="FFFFFF"/>
+                <w:sz w:val="20"/>
+              </w:rPr>
+              <w:t>Jawaban yang benar</w:t>
+            </w:r>
+          </w:p>
+        </w:tc>
+      </w:tr>
+      <w:tr>
+        <w:tc>
+          <w:tcPr>
+            <w:tcW w:type="dxa" w:w="4986"/>
+          </w:tcPr>
+          <w:p>
+            <w:r/>
+            <w:r>
+              <w:rPr>
+                <w:b w:val="0"/>
+                <w:i w:val="0"/>
+                <w:sz w:val="20"/>
+              </w:rPr>
+              <w:t>1. Kualitas</w:t>
+            </w:r>
+          </w:p>
+        </w:tc>
+        <w:tc>
+          <w:tcPr>
+            <w:tcW w:type="dxa" w:w="4986"/>
+          </w:tcPr>
+          <w:p>
+            <w:r/>
+            <w:r>
+              <w:rPr>
+                <w:b w:val="0"/>
+                <w:i w:val="0"/>
+                <w:sz w:val="20"/>
+              </w:rPr>
+              <w:t>Grade 2. Kunci resmi: skapula menutupi lapangan paru kedua sisi, sudut kostofrenikus kanan terpotong, artefak pakaian di kedua apeks. Komentar wajib ditulis</w:t>
+            </w:r>
+          </w:p>
+        </w:tc>
+      </w:tr>
+      <w:tr>
+        <w:tc>
+          <w:tcPr>
+            <w:tcW w:type="dxa" w:w="4986"/>
+          </w:tcPr>
+          <w:p>
+            <w:r/>
+            <w:r>
+              <w:rPr>
+                <w:b w:val="0"/>
+                <w:i w:val="0"/>
+                <w:sz w:val="20"/>
+              </w:rPr>
+              <w:t>2A</w:t>
+            </w:r>
+          </w:p>
+        </w:tc>
+        <w:tc>
+          <w:tcPr>
+            <w:tcW w:type="dxa" w:w="4986"/>
+          </w:tcPr>
+          <w:p>
+            <w:r/>
+            <w:r>
+              <w:rPr>
+                <w:b w:val="0"/>
+                <w:i w:val="0"/>
+                <w:sz w:val="20"/>
+              </w:rPr>
+              <w:t>Yes</w:t>
+            </w:r>
+          </w:p>
+        </w:tc>
+      </w:tr>
+      <w:tr>
+        <w:tc>
+          <w:tcPr>
+            <w:tcW w:type="dxa" w:w="4986"/>
+          </w:tcPr>
+          <w:p>
+            <w:r/>
+            <w:r>
+              <w:rPr>
+                <w:b w:val="0"/>
+                <w:i w:val="0"/>
+                <w:sz w:val="20"/>
+              </w:rPr>
+              <w:t>3. Zona</w:t>
+            </w:r>
+          </w:p>
+        </w:tc>
+        <w:tc>
+          <w:tcPr>
+            <w:tcW w:type="dxa" w:w="4986"/>
+          </w:tcPr>
+          <w:p>
+            <w:r/>
+            <w:r>
+              <w:rPr>
+                <w:b w:val="0"/>
+                <w:i w:val="0"/>
+                <w:sz w:val="20"/>
+              </w:rPr>
+              <w:t>Keenam zona (RU, RM, RL, LU, LM, LL)</w:t>
+            </w:r>
+          </w:p>
+        </w:tc>
+      </w:tr>
+      <w:tr>
+        <w:tc>
+          <w:tcPr>
+            <w:tcW w:type="dxa" w:w="4986"/>
+          </w:tcPr>
+          <w:p>
+            <w:r/>
+            <w:r>
+              <w:rPr>
+                <w:b w:val="0"/>
+                <w:i w:val="0"/>
+                <w:sz w:val="20"/>
+              </w:rPr>
+              <w:t>4. Bentuk/ukuran</w:t>
+            </w:r>
+          </w:p>
+        </w:tc>
+        <w:tc>
+          <w:tcPr>
+            <w:tcW w:type="dxa" w:w="4986"/>
+          </w:tcPr>
+          <w:p>
+            <w:r/>
+            <w:r>
+              <w:rPr>
+                <w:b w:val="0"/>
+                <w:i w:val="0"/>
+                <w:sz w:val="20"/>
+              </w:rPr>
+              <w:t>q/q (bintik bulat 1,5-3 mm)</w:t>
+            </w:r>
+          </w:p>
+        </w:tc>
+      </w:tr>
+      <w:tr>
+        <w:tc>
+          <w:tcPr>
+            <w:tcW w:type="dxa" w:w="4986"/>
+          </w:tcPr>
+          <w:p>
+            <w:r/>
+            <w:r>
+              <w:rPr>
+                <w:b w:val="0"/>
+                <w:i w:val="0"/>
+                <w:sz w:val="20"/>
+              </w:rPr>
+              <w:t>5. Profusion</w:t>
+            </w:r>
+          </w:p>
+        </w:tc>
+        <w:tc>
+          <w:tcPr>
+            <w:tcW w:type="dxa" w:w="4986"/>
+          </w:tcPr>
+          <w:p>
+            <w:r/>
+            <w:r>
+              <w:rPr>
+                <w:b/>
+                <w:i w:val="0"/>
+                <w:sz w:val="20"/>
+              </w:rPr>
+              <w:t>2/2</w:t>
+            </w:r>
+            <w:r>
+              <w:rPr>
+                <w:b w:val="0"/>
+                <w:i w:val="0"/>
+                <w:sz w:val="20"/>
+              </w:rPr>
+              <w:t>: lebih padat dari 1/1, corakan vaskular sebagian samar, belum sepadat 3/3</w:t>
+            </w:r>
+          </w:p>
+        </w:tc>
+      </w:tr>
+      <w:tr>
+        <w:tc>
+          <w:tcPr>
+            <w:tcW w:type="dxa" w:w="4986"/>
+          </w:tcPr>
+          <w:p>
+            <w:r/>
+            <w:r>
+              <w:rPr>
+                <w:b w:val="0"/>
+                <w:i w:val="0"/>
+                <w:sz w:val="20"/>
+              </w:rPr>
+              <w:t>6. Opasitas besar</w:t>
+            </w:r>
+          </w:p>
+        </w:tc>
+        <w:tc>
+          <w:tcPr>
+            <w:tcW w:type="dxa" w:w="4986"/>
+          </w:tcPr>
+          <w:p>
+            <w:r/>
+            <w:r>
+              <w:rPr>
+                <w:b w:val="0"/>
+                <w:i w:val="0"/>
+                <w:sz w:val="20"/>
+              </w:rPr>
+              <w:t>0</w:t>
+            </w:r>
+          </w:p>
+        </w:tc>
+      </w:tr>
+      <w:tr>
+        <w:tc>
+          <w:tcPr>
+            <w:tcW w:type="dxa" w:w="4986"/>
+          </w:tcPr>
+          <w:p>
+            <w:r/>
+            <w:r>
+              <w:rPr>
+                <w:b w:val="0"/>
+                <w:i w:val="0"/>
+                <w:sz w:val="20"/>
+              </w:rPr>
+              <w:t>7. Pleura</w:t>
+            </w:r>
+          </w:p>
+        </w:tc>
+        <w:tc>
+          <w:tcPr>
+            <w:tcW w:type="dxa" w:w="4986"/>
+          </w:tcPr>
+          <w:p>
+            <w:r/>
+            <w:r>
+              <w:rPr>
+                <w:b w:val="0"/>
+                <w:i w:val="0"/>
+                <w:sz w:val="20"/>
+              </w:rPr>
+              <w:t>Tidak ada plak, tidak ada penebalan difus, tidak ada obliterasi sudut</w:t>
+            </w:r>
+          </w:p>
+        </w:tc>
+      </w:tr>
+      <w:tr>
+        <w:tc>
+          <w:tcPr>
+            <w:tcW w:type="dxa" w:w="4986"/>
+          </w:tcPr>
+          <w:p>
+            <w:r/>
+            <w:r>
+              <w:rPr>
+                <w:b w:val="0"/>
+                <w:i w:val="0"/>
+                <w:sz w:val="20"/>
+              </w:rPr>
+              <w:t>8. Simbol</w:t>
+            </w:r>
+          </w:p>
+        </w:tc>
+        <w:tc>
+          <w:tcPr>
+            <w:tcW w:type="dxa" w:w="4986"/>
+          </w:tcPr>
+          <w:p>
+            <w:r/>
+            <w:r>
+              <w:rPr>
+                <w:b w:val="0"/>
+                <w:i w:val="0"/>
+                <w:sz w:val="20"/>
+              </w:rPr>
+              <w:t>Tidak ada</w:t>
+            </w:r>
+          </w:p>
+        </w:tc>
+      </w:tr>
+      <w:tr>
+        <w:tc>
+          <w:tcPr>
+            <w:tcW w:type="dxa" w:w="4986"/>
+          </w:tcPr>
+          <w:p>
+            <w:r/>
+            <w:r>
+              <w:rPr>
+                <w:b w:val="0"/>
+                <w:i w:val="0"/>
+                <w:sz w:val="20"/>
+              </w:rPr>
+              <w:t>10. Kesan</w:t>
+            </w:r>
+          </w:p>
+        </w:tc>
+        <w:tc>
+          <w:tcPr>
+            <w:tcW w:type="dxa" w:w="4986"/>
+          </w:tcPr>
+          <w:p>
+            <w:r/>
+            <w:r>
+              <w:rPr>
+                <w:b w:val="0"/>
+                <w:i w:val="0"/>
+                <w:sz w:val="20"/>
+              </w:rPr>
+              <w:t>Pneumokoniosis simple, profusion 2/2 q/q, enam zona, kualitas 2. Rekomendasi: HRCT, spirometri, skrining TB, 7 langkah PAK</w:t>
+            </w:r>
+          </w:p>
+        </w:tc>
+      </w:tr>
+    </w:tbl>
+    <w:p>
+      <w:pPr>
+        <w:spacing w:after="40"/>
+      </w:pPr>
+    </w:p>
+    <w:p>
+      <w:pPr>
+        <w:pStyle w:val="Heading3"/>
+      </w:pPr>
+      <w:r>
+        <w:t>Latihan terpandu 2: film opasitas besar kategori A</w:t>
+      </w:r>
+    </w:p>
+    <w:p>
+      <w:r>
+        <w:rPr>
+          <w:b w:val="0"/>
+          <w:i w:val="0"/>
+        </w:rPr>
+        <w:t>Gunakan film kiri pada Gambar 6.5.</w:t>
+      </w:r>
+    </w:p>
+    <w:tbl>
+      <w:tblPr>
+        <w:tblStyle w:val="TableGrid"/>
+        <w:tblW w:type="auto" w:w="0"/>
+        <w:tblLook w:firstColumn="1" w:firstRow="1" w:lastColumn="0" w:lastRow="0" w:noHBand="0" w:noVBand="1" w:val="04A0"/>
+      </w:tblPr>
+      <w:tblGrid>
+        <w:gridCol w:w="4986"/>
+        <w:gridCol w:w="4986"/>
+      </w:tblGrid>
+      <w:tr>
+        <w:trPr>
+          <w:tblHeader w:val="true"/>
+        </w:trPr>
+        <w:tc>
+          <w:tcPr>
+            <w:tcW w:type="dxa" w:w="4986"/>
+            <w:shd w:val="clear" w:color="auto" w:fill="1F3A5F"/>
+          </w:tcPr>
+          <w:p>
+            <w:r>
+              <w:rPr>
+                <w:color w:val="FFFFFF"/>
+              </w:rPr>
+            </w:r>
+            <w:r>
+              <w:rPr>
+                <w:b/>
+                <w:i w:val="0"/>
+                <w:color w:val="FFFFFF"/>
+                <w:sz w:val="20"/>
+              </w:rPr>
+              <w:t>Langkah</w:t>
+            </w:r>
+          </w:p>
+        </w:tc>
+        <w:tc>
+          <w:tcPr>
+            <w:tcW w:type="dxa" w:w="4986"/>
+            <w:shd w:val="clear" w:color="auto" w:fill="1F3A5F"/>
+          </w:tcPr>
+          <w:p>
+            <w:r>
+              <w:rPr>
+                <w:color w:val="FFFFFF"/>
+              </w:rPr>
+            </w:r>
+            <w:r>
+              <w:rPr>
+                <w:b/>
+                <w:i w:val="0"/>
+                <w:color w:val="FFFFFF"/>
+                <w:sz w:val="20"/>
+              </w:rPr>
+              <w:t>Jawaban yang benar (kunci resmi ILO 2022)</w:t>
+            </w:r>
+          </w:p>
+        </w:tc>
+      </w:tr>
+      <w:tr>
+        <w:tc>
+          <w:tcPr>
+            <w:tcW w:type="dxa" w:w="4986"/>
+          </w:tcPr>
+          <w:p>
+            <w:r/>
+            <w:r>
+              <w:rPr>
+                <w:b w:val="0"/>
+                <w:i w:val="0"/>
+                <w:sz w:val="20"/>
+              </w:rPr>
+              <w:t>1. Kualitas</w:t>
+            </w:r>
+          </w:p>
+        </w:tc>
+        <w:tc>
+          <w:tcPr>
+            <w:tcW w:type="dxa" w:w="4986"/>
+          </w:tcPr>
+          <w:p>
+            <w:r/>
+            <w:r>
+              <w:rPr>
+                <w:b w:val="0"/>
+                <w:i w:val="0"/>
+                <w:sz w:val="20"/>
+              </w:rPr>
+              <w:t>Grade 2 (skapula menutupi lapangan paru)</w:t>
+            </w:r>
+          </w:p>
+        </w:tc>
+      </w:tr>
+      <w:tr>
+        <w:tc>
+          <w:tcPr>
+            <w:tcW w:type="dxa" w:w="4986"/>
+          </w:tcPr>
+          <w:p>
+            <w:r/>
+            <w:r>
+              <w:rPr>
+                <w:b w:val="0"/>
+                <w:i w:val="0"/>
+                <w:sz w:val="20"/>
+              </w:rPr>
+              <w:t>3. Zona</w:t>
+            </w:r>
+          </w:p>
+        </w:tc>
+        <w:tc>
+          <w:tcPr>
+            <w:tcW w:type="dxa" w:w="4986"/>
+          </w:tcPr>
+          <w:p>
+            <w:r/>
+            <w:r>
+              <w:rPr>
+                <w:b w:val="0"/>
+                <w:i w:val="0"/>
+                <w:sz w:val="20"/>
+              </w:rPr>
+              <w:t>Enam zona</w:t>
+            </w:r>
+          </w:p>
+        </w:tc>
+      </w:tr>
+      <w:tr>
+        <w:tc>
+          <w:tcPr>
+            <w:tcW w:type="dxa" w:w="4986"/>
+          </w:tcPr>
+          <w:p>
+            <w:r/>
+            <w:r>
+              <w:rPr>
+                <w:b w:val="0"/>
+                <w:i w:val="0"/>
+                <w:sz w:val="20"/>
+              </w:rPr>
+              <w:t>4-5. Bentuk dan profusion</w:t>
+            </w:r>
+          </w:p>
+        </w:tc>
+        <w:tc>
+          <w:tcPr>
+            <w:tcW w:type="dxa" w:w="4986"/>
+          </w:tcPr>
+          <w:p>
+            <w:r/>
+            <w:r>
+              <w:rPr>
+                <w:b w:val="0"/>
+                <w:i w:val="0"/>
+                <w:sz w:val="20"/>
+              </w:rPr>
+              <w:t xml:space="preserve">q/r, profusion </w:t>
+            </w:r>
+            <w:r>
+              <w:rPr>
+                <w:b/>
+                <w:i w:val="0"/>
+                <w:sz w:val="20"/>
+              </w:rPr>
+              <w:t>2/3</w:t>
+            </w:r>
+          </w:p>
+        </w:tc>
+      </w:tr>
+      <w:tr>
+        <w:tc>
+          <w:tcPr>
+            <w:tcW w:type="dxa" w:w="4986"/>
+          </w:tcPr>
+          <w:p>
+            <w:r/>
+            <w:r>
+              <w:rPr>
+                <w:b w:val="0"/>
+                <w:i w:val="0"/>
+                <w:sz w:val="20"/>
+              </w:rPr>
+              <w:t>6. Opasitas besar</w:t>
+            </w:r>
+          </w:p>
+        </w:tc>
+        <w:tc>
+          <w:tcPr>
+            <w:tcW w:type="dxa" w:w="4986"/>
+          </w:tcPr>
+          <w:p>
+            <w:r/>
+            <w:r>
+              <w:rPr>
+                <w:b/>
+                <w:i w:val="0"/>
+                <w:sz w:val="20"/>
+              </w:rPr>
+              <w:t>A</w:t>
+            </w:r>
+            <w:r>
+              <w:rPr>
+                <w:b w:val="0"/>
+                <w:i w:val="0"/>
+                <w:sz w:val="20"/>
+              </w:rPr>
+              <w:t>: satu opasitas besar di zona atas kanan</w:t>
+            </w:r>
+          </w:p>
+        </w:tc>
+      </w:tr>
+      <w:tr>
+        <w:tc>
+          <w:tcPr>
+            <w:tcW w:type="dxa" w:w="4986"/>
+          </w:tcPr>
+          <w:p>
+            <w:r/>
+            <w:r>
+              <w:rPr>
+                <w:b w:val="0"/>
+                <w:i w:val="0"/>
+                <w:sz w:val="20"/>
+              </w:rPr>
+              <w:t>7. Pleura</w:t>
+            </w:r>
+          </w:p>
+        </w:tc>
+        <w:tc>
+          <w:tcPr>
+            <w:tcW w:type="dxa" w:w="4986"/>
+          </w:tcPr>
+          <w:p>
+            <w:r/>
+            <w:r>
+              <w:rPr>
+                <w:b w:val="0"/>
+                <w:i w:val="0"/>
+                <w:sz w:val="20"/>
+              </w:rPr>
+              <w:t>Tidak ada</w:t>
+            </w:r>
+          </w:p>
+        </w:tc>
+      </w:tr>
+      <w:tr>
+        <w:tc>
+          <w:tcPr>
+            <w:tcW w:type="dxa" w:w="4986"/>
+          </w:tcPr>
+          <w:p>
+            <w:r/>
+            <w:r>
+              <w:rPr>
+                <w:b w:val="0"/>
+                <w:i w:val="0"/>
+                <w:sz w:val="20"/>
+              </w:rPr>
+              <w:t>8. Simbol</w:t>
+            </w:r>
+          </w:p>
+        </w:tc>
+        <w:tc>
+          <w:tcPr>
+            <w:tcW w:type="dxa" w:w="4986"/>
+          </w:tcPr>
+          <w:p>
+            <w:r/>
+            <w:r>
+              <w:rPr>
+                <w:b/>
+                <w:i w:val="0"/>
+                <w:sz w:val="20"/>
+              </w:rPr>
+              <w:t>aa</w:t>
+            </w:r>
+            <w:r>
+              <w:rPr>
+                <w:b w:val="0"/>
+                <w:i w:val="0"/>
+                <w:sz w:val="20"/>
+              </w:rPr>
+              <w:t xml:space="preserve"> (aorta aterosklerotik), </w:t>
+            </w:r>
+            <w:r>
+              <w:rPr>
+                <w:b/>
+                <w:i w:val="0"/>
+                <w:sz w:val="20"/>
+              </w:rPr>
+              <w:t>ax</w:t>
+            </w:r>
+            <w:r>
+              <w:rPr>
+                <w:b w:val="0"/>
+                <w:i w:val="0"/>
+                <w:sz w:val="20"/>
+              </w:rPr>
+              <w:t xml:space="preserve"> (koalesensi opasitas kecil di zona atas kanan)</w:t>
+            </w:r>
+          </w:p>
+        </w:tc>
+      </w:tr>
+      <w:tr>
+        <w:tc>
+          <w:tcPr>
+            <w:tcW w:type="dxa" w:w="4986"/>
+          </w:tcPr>
+          <w:p>
+            <w:r/>
+            <w:r>
+              <w:rPr>
+                <w:b w:val="0"/>
+                <w:i w:val="0"/>
+                <w:sz w:val="20"/>
+              </w:rPr>
+              <w:t>10. Kesan</w:t>
+            </w:r>
+          </w:p>
+        </w:tc>
+        <w:tc>
+          <w:tcPr>
+            <w:tcW w:type="dxa" w:w="4986"/>
+          </w:tcPr>
+          <w:p>
+            <w:r/>
+            <w:r>
+              <w:rPr>
+                <w:b w:val="0"/>
+                <w:i w:val="0"/>
+                <w:sz w:val="20"/>
+              </w:rPr>
+              <w:t>Pneumokoniosis complicated (PMF kategori A) di atas latar profusion 2/3. Rekomendasi: skrining TB aktif, HRCT, spirometri, rujuk spesialis paru/okupasi</w:t>
+            </w:r>
+          </w:p>
+        </w:tc>
+      </w:tr>
+    </w:tbl>
+    <w:p>
+      <w:pPr>
+        <w:spacing w:after="40"/>
+      </w:pPr>
+    </w:p>
+    <w:p>
+      <w:pPr>
+        <w:pStyle w:val="Heading3"/>
+      </w:pPr>
+      <w:r>
+        <w:t>Latihan terpandu 3: film pleura</w:t>
+      </w:r>
+    </w:p>
+    <w:p>
+      <w:r>
+        <w:rPr>
+          <w:b w:val="0"/>
+          <w:i w:val="0"/>
+        </w:rPr>
+        <w:t>Gunakan film kiri pada Gambar 6.8.</w:t>
+      </w:r>
+    </w:p>
+    <w:tbl>
+      <w:tblPr>
+        <w:tblStyle w:val="TableGrid"/>
+        <w:tblW w:type="auto" w:w="0"/>
+        <w:tblLook w:firstColumn="1" w:firstRow="1" w:lastColumn="0" w:lastRow="0" w:noHBand="0" w:noVBand="1" w:val="04A0"/>
+      </w:tblPr>
+      <w:tblGrid>
+        <w:gridCol w:w="4986"/>
+        <w:gridCol w:w="4986"/>
+      </w:tblGrid>
+      <w:tr>
+        <w:trPr>
+          <w:tblHeader w:val="true"/>
+        </w:trPr>
+        <w:tc>
+          <w:tcPr>
+            <w:tcW w:type="dxa" w:w="4986"/>
+            <w:shd w:val="clear" w:color="auto" w:fill="1F3A5F"/>
+          </w:tcPr>
+          <w:p>
+            <w:r>
+              <w:rPr>
+                <w:color w:val="FFFFFF"/>
+              </w:rPr>
+            </w:r>
+            <w:r>
+              <w:rPr>
+                <w:b/>
+                <w:i w:val="0"/>
+                <w:color w:val="FFFFFF"/>
+                <w:sz w:val="20"/>
+              </w:rPr>
+              <w:t>Langkah</w:t>
+            </w:r>
+          </w:p>
+        </w:tc>
+        <w:tc>
+          <w:tcPr>
+            <w:tcW w:type="dxa" w:w="4986"/>
+            <w:shd w:val="clear" w:color="auto" w:fill="1F3A5F"/>
+          </w:tcPr>
+          <w:p>
+            <w:r>
+              <w:rPr>
+                <w:color w:val="FFFFFF"/>
+              </w:rPr>
+            </w:r>
+            <w:r>
+              <w:rPr>
+                <w:b/>
+                <w:i w:val="0"/>
+                <w:color w:val="FFFFFF"/>
+                <w:sz w:val="20"/>
+              </w:rPr>
+              <w:t>Jawaban yang benar</w:t>
+            </w:r>
+          </w:p>
+        </w:tc>
+      </w:tr>
+      <w:tr>
+        <w:tc>
+          <w:tcPr>
+            <w:tcW w:type="dxa" w:w="4986"/>
+          </w:tcPr>
+          <w:p>
+            <w:r/>
+            <w:r>
+              <w:rPr>
+                <w:b w:val="0"/>
+                <w:i w:val="0"/>
+                <w:sz w:val="20"/>
+              </w:rPr>
+              <w:t>1. Kualitas</w:t>
+            </w:r>
+          </w:p>
+        </w:tc>
+        <w:tc>
+          <w:tcPr>
+            <w:tcW w:type="dxa" w:w="4986"/>
+          </w:tcPr>
+          <w:p>
+            <w:r/>
+            <w:r>
+              <w:rPr>
+                <w:b w:val="0"/>
+                <w:i w:val="0"/>
+                <w:sz w:val="20"/>
+              </w:rPr>
+              <w:t>Grade 2 (mottle)</w:t>
+            </w:r>
+          </w:p>
+        </w:tc>
+      </w:tr>
+      <w:tr>
+        <w:tc>
+          <w:tcPr>
+            <w:tcW w:type="dxa" w:w="4986"/>
+          </w:tcPr>
+          <w:p>
+            <w:r/>
+            <w:r>
+              <w:rPr>
+                <w:b w:val="0"/>
+                <w:i w:val="0"/>
+                <w:sz w:val="20"/>
+              </w:rPr>
+              <w:t>2. Parenkim</w:t>
+            </w:r>
+          </w:p>
+        </w:tc>
+        <w:tc>
+          <w:tcPr>
+            <w:tcW w:type="dxa" w:w="4986"/>
+          </w:tcPr>
+          <w:p>
+            <w:r/>
+            <w:r>
+              <w:rPr>
+                <w:b w:val="0"/>
+                <w:i w:val="0"/>
+                <w:sz w:val="20"/>
+              </w:rPr>
+              <w:t>Tidak ada opasitas kecil atau besar yang dikoding</w:t>
+            </w:r>
+          </w:p>
+        </w:tc>
+      </w:tr>
+      <w:tr>
+        <w:tc>
+          <w:tcPr>
+            <w:tcW w:type="dxa" w:w="4986"/>
+          </w:tcPr>
+          <w:p>
+            <w:r/>
+            <w:r>
+              <w:rPr>
+                <w:b w:val="0"/>
+                <w:i w:val="0"/>
+                <w:sz w:val="20"/>
+              </w:rPr>
+              <w:t>7. Pleura</w:t>
+            </w:r>
+          </w:p>
+        </w:tc>
+        <w:tc>
+          <w:tcPr>
+            <w:tcW w:type="dxa" w:w="4986"/>
+          </w:tcPr>
+          <w:p>
+            <w:r/>
+            <w:r>
+              <w:rPr>
+                <w:b w:val="0"/>
+                <w:i w:val="0"/>
+                <w:sz w:val="20"/>
+              </w:rPr>
+              <w:t>Plak dan penebalan difus ada, obliterasi sudut kostofrenikus ada, kalsifikasi ada. Sisi dan lokasi yang tepat (dinding dada in-profile dan face-on, diafragma) lihat tabel ILO 2022 Appendix C hal. 27</w:t>
+            </w:r>
+          </w:p>
+        </w:tc>
+      </w:tr>
+      <w:tr>
+        <w:tc>
+          <w:tcPr>
+            <w:tcW w:type="dxa" w:w="4986"/>
+          </w:tcPr>
+          <w:p>
+            <w:r/>
+            <w:r>
+              <w:rPr>
+                <w:b w:val="0"/>
+                <w:i w:val="0"/>
+                <w:sz w:val="20"/>
+              </w:rPr>
+              <w:t>8. Simbol</w:t>
+            </w:r>
+          </w:p>
+        </w:tc>
+        <w:tc>
+          <w:tcPr>
+            <w:tcW w:type="dxa" w:w="4986"/>
+          </w:tcPr>
+          <w:p>
+            <w:r/>
+            <w:r>
+              <w:rPr>
+                <w:b/>
+                <w:i w:val="0"/>
+                <w:sz w:val="20"/>
+              </w:rPr>
+              <w:t>aa</w:t>
+            </w:r>
+            <w:r>
+              <w:rPr>
+                <w:b w:val="0"/>
+                <w:i w:val="0"/>
+                <w:sz w:val="20"/>
+              </w:rPr>
+              <w:t xml:space="preserve">, </w:t>
+            </w:r>
+            <w:r>
+              <w:rPr>
+                <w:b/>
+                <w:i w:val="0"/>
+                <w:sz w:val="20"/>
+              </w:rPr>
+              <w:t>me</w:t>
+            </w:r>
+          </w:p>
+        </w:tc>
+      </w:tr>
+      <w:tr>
+        <w:tc>
+          <w:tcPr>
+            <w:tcW w:type="dxa" w:w="4986"/>
+          </w:tcPr>
+          <w:p>
+            <w:r/>
+            <w:r>
+              <w:rPr>
+                <w:b w:val="0"/>
+                <w:i w:val="0"/>
+                <w:sz w:val="20"/>
+              </w:rPr>
+              <w:t>10. Kesan</w:t>
+            </w:r>
+          </w:p>
+        </w:tc>
+        <w:tc>
+          <w:tcPr>
+            <w:tcW w:type="dxa" w:w="4986"/>
+          </w:tcPr>
+          <w:p>
+            <w:r/>
+            <w:r>
+              <w:rPr>
+                <w:b w:val="0"/>
+                <w:i w:val="0"/>
+                <w:sz w:val="20"/>
+              </w:rPr>
+              <w:t xml:space="preserve">Kelainan pleura asbes-like kalsifikasi dengan penebalan difus. </w:t>
+            </w:r>
+            <w:r>
+              <w:rPr>
+                <w:b/>
+                <w:i w:val="0"/>
+                <w:sz w:val="20"/>
+              </w:rPr>
+              <w:t>Pertimbangkan mesotelioma</w:t>
+            </w:r>
+            <w:r>
+              <w:rPr>
+                <w:b w:val="0"/>
+                <w:i w:val="0"/>
+                <w:sz w:val="20"/>
+              </w:rPr>
+              <w:t xml:space="preserve"> (komentar wajib bila memakai me bukan akibat debu), rekomendasi HRCT toraks, rujuk, riwayat pajanan asbes</w:t>
+            </w:r>
+          </w:p>
+        </w:tc>
+      </w:tr>
+    </w:tbl>
+    <w:p>
+      <w:pPr>
+        <w:spacing w:after="40"/>
+      </w:pPr>
+    </w:p>
+    <w:p>
+      <w:r>
+        <w:rPr>
+          <w:b/>
+          <w:i w:val="0"/>
+        </w:rPr>
+        <w:t>Cara berlatih mandiri.</w:t>
+      </w:r>
+      <w:r>
+        <w:rPr>
+          <w:b w:val="0"/>
+          <w:i w:val="0"/>
+        </w:rPr>
+        <w:t xml:space="preserve"> (1) Tutup label ILO di bawah film. (2) Isi lembar baca dari langkah 1 sampai 9. (3) Cocokkan dengan Appendix C ILO Guidelines 2022 (hal. 24-27) yang memuat kunci resmi seluruh 23 film standar. (4) Catat langkah yang sering salah, biasanya kualitas, profusion antara dua kategori, dan simbol.</w:t>
+      </w:r>
+    </w:p>
+    <w:p>
+      <w:r>
+        <w:rPr>
+          <w:b/>
+          <w:i w:val="0"/>
+        </w:rPr>
+        <w:t>Sumber gambar dan video.</w:t>
+      </w:r>
+      <w:r>
+        <w:rPr>
+          <w:b w:val="0"/>
+          <w:i w:val="0"/>
+        </w:rPr>
+        <w:t xml:space="preserve"> Seluruh gambar berasal dari ILO Guidelines 2022 (wcms_867859.pdf) dan set ILO standard digital images (ilo-radiographs-jpegs.zip) di folder Materi Board\ILO. Video diskusi board (3. Diskusi Board 20260519 Mbak Venny, 1 jam 52 menit) saya periksa lewat 28 bingkai cuplikan tanpa audio: urutannya sama dengan lembar baca di atas (identitas, kualitas, parenkim, pleura, sudut kostofrenikus, simbol), lalu latihan kasus dengan lembar baca terisi dan viewer film standar. Isi lisan diskusi (alasan penguji, tips) belum tercakup karena tidak ada transkrip. </w:t>
+      </w:r>
+      <w:r>
+        <w:rPr>
+          <w:b/>
+          <w:i w:val="0"/>
+          <w:color w:val="C00000"/>
+        </w:rPr>
+        <w:t>[VERIFIKASI]</w:t>
+      </w:r>
+      <w:r>
+        <w:rPr>
+          <w:b w:val="0"/>
+          <w:i w:val="0"/>
+        </w:rPr>
+        <w:t xml:space="preserve"> Bila Anda ingin tips lisan dimasukkan, perlu transkrip video.</w:t>
+      </w:r>
+    </w:p>
+    <w:p>
+      <w:pPr>
         <w:pStyle w:val="Heading1"/>
       </w:pPr>
       <w:r>
@@ -12587,6 +15661,67 @@
       </w:pPr>
       <w:r>
         <w:t>Vignette dan kunci jawaban</w:t>
+      </w:r>
+    </w:p>
+    <w:p>
+      <w:pPr>
+        <w:keepNext/>
+        <w:jc w:val="center"/>
+      </w:pPr>
+      <w:r>
+        <w:drawing>
+          <wp:inline xmlns:a="http://schemas.openxmlformats.org/drawingml/2006/main" xmlns:pic="http://schemas.openxmlformats.org/drawingml/2006/picture">
+            <wp:extent cx="4680000" cy="5607000"/>
+            <wp:docPr id="13" name="Picture 13"/>
+            <wp:cNvGraphicFramePr>
+              <a:graphicFrameLocks noChangeAspect="1"/>
+            </wp:cNvGraphicFramePr>
+            <a:graphic>
+              <a:graphicData uri="http://schemas.openxmlformats.org/drawingml/2006/picture">
+                <pic:pic>
+                  <pic:nvPicPr>
+                    <pic:cNvPr id="0" name="vig.jpg"/>
+                    <pic:cNvPicPr/>
+                  </pic:nvPicPr>
+                  <pic:blipFill>
+                    <a:blip r:embed="rId21"/>
+                    <a:stretch>
+                      <a:fillRect/>
+                    </a:stretch>
+                  </pic:blipFill>
+                  <pic:spPr>
+                    <a:xfrm>
+                      <a:off x="0" y="0"/>
+                      <a:ext cx="4680000" cy="5607000"/>
+                    </a:xfrm>
+                    <a:prstGeom prst="rect"/>
+                  </pic:spPr>
+                </pic:pic>
+              </a:graphicData>
+            </a:graphic>
+          </wp:inline>
+        </w:drawing>
+      </w:r>
+    </w:p>
+    <w:p>
+      <w:pPr>
+        <w:jc w:val="center"/>
+      </w:pPr>
+      <w:r>
+        <w:rPr>
+          <w:b/>
+          <w:i/>
+          <w:sz w:val="18"/>
+        </w:rPr>
+        <w:t>Gambar 13.1.</w:t>
+      </w:r>
+      <w:r>
+        <w:rPr>
+          <w:b w:val="0"/>
+          <w:i/>
+          <w:sz w:val="18"/>
+        </w:rPr>
+        <w:t xml:space="preserve"> Ilustrasi pola untuk vignette, diambil dari film standar ILO (bukan film kasus pasien): 1/1 q/q zona atas-tengah (vignette 1), 1/1 s/s zona bawah (vignette 2, tanpa plak pada film ini), opasitas besar A (vignette 3), 1/1 p/p (vignette 4). Vignette 5 tidak diilustrasikan karena film kualitas 4 tidak untuk dibaca.</w:t>
       </w:r>
     </w:p>
     <w:p>

</xml_diff>

<commit_message>
Add exam tips from transcribed ILO board discussion video to ILO notes
Co-Authored-By: Claude Sonnet 5.5 <noreply@anthropic.com>
Claude-Session: https://claude.ai/code/session_01ANYSSQ1xyWYt7dPU8XV1wB
</commit_message>
<xml_diff>
--- a/PPDS Okupasi Board Notes/Catatan ILO Radiograph.docx
+++ b/PPDS Okupasi Board Notes/Catatan ILO Radiograph.docx
@@ -10880,20 +10880,14 @@
       </w:r>
     </w:p>
     <w:p>
-      <w:r>
-        <w:rPr>
-          <w:b/>
-          <w:i w:val="0"/>
-        </w:rPr>
-        <w:t>Sumber gambar dan video.</w:t>
-      </w:r>
-      <w:r>
-        <w:rPr>
-          <w:b w:val="0"/>
-          <w:i w:val="0"/>
-        </w:rPr>
-        <w:t xml:space="preserve"> Seluruh gambar berasal dari ILO Guidelines 2022 (wcms_867859.pdf) dan set ILO standard digital images (ilo-radiographs-jpegs.zip) di folder Materi Board\ILO. Video diskusi board (3. Diskusi Board 20260519 Mbak Venny, 1 jam 52 menit) saya periksa lewat 28 bingkai cuplikan tanpa audio: urutannya sama dengan lembar baca di atas (identitas, kualitas, parenkim, pleura, sudut kostofrenikus, simbol), lalu latihan kasus dengan lembar baca terisi dan viewer film standar. Isi lisan diskusi (alasan penguji, tips) belum tercakup karena tidak ada transkrip. </w:t>
-      </w:r>
+      <w:pPr>
+        <w:pStyle w:val="Heading3"/>
+      </w:pPr>
+      <w:r>
+        <w:t>Tips membaca dari diskusi board 19 Mei 2026 (sharing Mbak Venny)</w:t>
+      </w:r>
+    </w:p>
+    <w:p>
       <w:r>
         <w:rPr>
           <w:b/>
@@ -10907,7 +10901,1788 @@
           <w:b w:val="0"/>
           <w:i w:val="0"/>
         </w:rPr>
-        <w:t xml:space="preserve"> Bila Anda ingin tips lisan dimasukkan, perlu transkrip video.</w:t>
+        <w:t xml:space="preserve"> Bagian ini diringkas dari transkrip otomatis video diskusi (WhisperX model small, dijalankan lokal). Ada kata yang salah dengar, jadi hanya inti yang jelas yang dimasukkan. Tips adalah pengalaman peserta ujian, bukan aturan ILO. Rumus dan batas angka tetap mengikuti ILO Guidelines 2022.</w:t>
+      </w:r>
+    </w:p>
+    <w:tbl>
+      <w:tblPr>
+        <w:tblStyle w:val="TableGrid"/>
+        <w:tblW w:type="auto" w:w="0"/>
+        <w:tblLook w:firstColumn="1" w:firstRow="1" w:lastColumn="0" w:lastRow="0" w:noHBand="0" w:noVBand="1" w:val="04A0"/>
+      </w:tblPr>
+      <w:tblGrid>
+        <w:gridCol w:w="4986"/>
+        <w:gridCol w:w="4986"/>
+      </w:tblGrid>
+      <w:tr>
+        <w:trPr>
+          <w:tblHeader w:val="true"/>
+        </w:trPr>
+        <w:tc>
+          <w:tcPr>
+            <w:tcW w:type="dxa" w:w="4986"/>
+            <w:shd w:val="clear" w:color="auto" w:fill="1F3A5F"/>
+          </w:tcPr>
+          <w:p>
+            <w:r>
+              <w:rPr>
+                <w:color w:val="FFFFFF"/>
+              </w:rPr>
+            </w:r>
+            <w:r>
+              <w:rPr>
+                <w:b/>
+                <w:i w:val="0"/>
+                <w:color w:val="FFFFFF"/>
+                <w:sz w:val="20"/>
+              </w:rPr>
+              <w:t>Langkah</w:t>
+            </w:r>
+          </w:p>
+        </w:tc>
+        <w:tc>
+          <w:tcPr>
+            <w:tcW w:type="dxa" w:w="4986"/>
+            <w:shd w:val="clear" w:color="auto" w:fill="1F3A5F"/>
+          </w:tcPr>
+          <w:p>
+            <w:r>
+              <w:rPr>
+                <w:color w:val="FFFFFF"/>
+              </w:rPr>
+            </w:r>
+            <w:r>
+              <w:rPr>
+                <w:b/>
+                <w:i w:val="0"/>
+                <w:color w:val="FFFFFF"/>
+                <w:sz w:val="20"/>
+              </w:rPr>
+              <w:t>Tips dari diskusi</w:t>
+            </w:r>
+          </w:p>
+        </w:tc>
+      </w:tr>
+      <w:tr>
+        <w:tc>
+          <w:tcPr>
+            <w:tcW w:type="dxa" w:w="4986"/>
+          </w:tcPr>
+          <w:p>
+            <w:r/>
+            <w:r>
+              <w:rPr>
+                <w:b/>
+                <w:i w:val="0"/>
+                <w:sz w:val="20"/>
+              </w:rPr>
+              <w:t>Lembar baca</w:t>
+            </w:r>
+          </w:p>
+        </w:tc>
+        <w:tc>
+          <w:tcPr>
+            <w:tcW w:type="dxa" w:w="4986"/>
+          </w:tcPr>
+          <w:p>
+            <w:r/>
+            <w:r>
+              <w:rPr>
+                <w:b w:val="0"/>
+                <w:i w:val="0"/>
+                <w:sz w:val="20"/>
+              </w:rPr>
+              <w:t xml:space="preserve">Lembar baca di ujian bisa satu lembar atau dua lembar bolak-balik. Isi semuanya, jangan sampai bagian di sisi belakang (mulai bagian 3D ke 4) terlewat. Di lembar hanya ada </w:t>
+            </w:r>
+            <w:r>
+              <w:rPr>
+                <w:b/>
+                <w:i w:val="0"/>
+                <w:sz w:val="20"/>
+              </w:rPr>
+              <w:t>singkatan</w:t>
+            </w:r>
+            <w:r>
+              <w:rPr>
+                <w:b w:val="0"/>
+                <w:i w:val="0"/>
+                <w:sz w:val="20"/>
+              </w:rPr>
+              <w:t>, tanpa keterangan, jadi 29 simbol harus dihafal</w:t>
+            </w:r>
+          </w:p>
+        </w:tc>
+      </w:tr>
+      <w:tr>
+        <w:tc>
+          <w:tcPr>
+            <w:tcW w:type="dxa" w:w="4986"/>
+          </w:tcPr>
+          <w:p>
+            <w:r/>
+            <w:r>
+              <w:rPr>
+                <w:b/>
+                <w:i w:val="0"/>
+                <w:sz w:val="20"/>
+              </w:rPr>
+              <w:t>1. Kualitas</w:t>
+            </w:r>
+          </w:p>
+        </w:tc>
+        <w:tc>
+          <w:tcPr>
+            <w:tcW w:type="dxa" w:w="4986"/>
+          </w:tcPr>
+          <w:p>
+            <w:r/>
+            <w:r>
+              <w:rPr>
+                <w:b/>
+                <w:i w:val="0"/>
+                <w:sz w:val="20"/>
+              </w:rPr>
+              <w:t>Tidak perlu film pembanding</w:t>
+            </w:r>
+            <w:r>
+              <w:rPr>
+                <w:b w:val="0"/>
+                <w:i w:val="0"/>
+                <w:sz w:val="20"/>
+              </w:rPr>
+              <w:t xml:space="preserve"> untuk kualitas, cukup penilaian mata. Grade 1: tidak perlu centang alasan. Grade 2 atau 3: </w:t>
+            </w:r>
+            <w:r>
+              <w:rPr>
+                <w:b/>
+                <w:i w:val="0"/>
+                <w:sz w:val="20"/>
+              </w:rPr>
+              <w:t>wajib centang alasan</w:t>
+            </w:r>
+            <w:r>
+              <w:rPr>
+                <w:b w:val="0"/>
+                <w:i w:val="0"/>
+                <w:sz w:val="20"/>
+              </w:rPr>
+              <w:t xml:space="preserve"> (overexposed, scapula overlay, underinflation, dll). Penilaian kualitas bergantung mata masing-masing: beda </w:t>
+            </w:r>
+            <w:r>
+              <w:rPr>
+                <w:b/>
+                <w:i w:val="0"/>
+                <w:sz w:val="20"/>
+              </w:rPr>
+              <w:t>satu tingkat</w:t>
+            </w:r>
+            <w:r>
+              <w:rPr>
+                <w:b w:val="0"/>
+                <w:i w:val="0"/>
+                <w:sz w:val="20"/>
+              </w:rPr>
+              <w:t xml:space="preserve"> dari ekspert masih aman, beda dua sampai tiga tingkat dianggap terlalu jauh (ekspert menilai 1 tetapi kita menilai 4 adalah masalah)</w:t>
+            </w:r>
+          </w:p>
+        </w:tc>
+      </w:tr>
+      <w:tr>
+        <w:tc>
+          <w:tcPr>
+            <w:tcW w:type="dxa" w:w="4986"/>
+          </w:tcPr>
+          <w:p>
+            <w:r/>
+            <w:r>
+              <w:rPr>
+                <w:b/>
+                <w:i w:val="0"/>
+                <w:sz w:val="20"/>
+              </w:rPr>
+              <w:t>2. Parenkim ada atau tidak</w:t>
+            </w:r>
+          </w:p>
+        </w:tc>
+        <w:tc>
+          <w:tcPr>
+            <w:tcW w:type="dxa" w:w="4986"/>
+          </w:tcPr>
+          <w:p>
+            <w:r/>
+            <w:r>
+              <w:rPr>
+                <w:b w:val="0"/>
+                <w:i w:val="0"/>
+                <w:sz w:val="20"/>
+              </w:rPr>
+              <w:t xml:space="preserve">Pada ujian angkatan sebelumnya </w:t>
+            </w:r>
+            <w:r>
+              <w:rPr>
+                <w:b/>
+                <w:i w:val="0"/>
+                <w:sz w:val="20"/>
+              </w:rPr>
+              <w:t>banyak film normal</w:t>
+            </w:r>
+            <w:r>
+              <w:rPr>
+                <w:b w:val="0"/>
+                <w:i w:val="0"/>
+                <w:sz w:val="20"/>
+              </w:rPr>
+              <w:t xml:space="preserve">: 2A jawabannya No, small opacity 0. Banyak peserta menjawab ada kelainan (PP, 0/1) karena merasa "ujian ILO pasti ada kelainan". Jangan over-thinking, dan </w:t>
+            </w:r>
+            <w:r>
+              <w:rPr>
+                <w:b/>
+                <w:i w:val="0"/>
+                <w:sz w:val="20"/>
+              </w:rPr>
+              <w:t>jangan melihat film terlalu lama</w:t>
+            </w:r>
+            <w:r>
+              <w:rPr>
+                <w:b w:val="0"/>
+                <w:i w:val="0"/>
+                <w:sz w:val="20"/>
+              </w:rPr>
+              <w:t xml:space="preserve"> karena makin lama dilihat makin banyak yang "terlihat" padahal tidak ada. Penguji ujian mengatakan tidak akan ada kasus yang aneh-aneh</w:t>
+            </w:r>
+          </w:p>
+        </w:tc>
+      </w:tr>
+      <w:tr>
+        <w:tc>
+          <w:tcPr>
+            <w:tcW w:type="dxa" w:w="4986"/>
+          </w:tcPr>
+          <w:p>
+            <w:r/>
+            <w:r>
+              <w:rPr>
+                <w:b/>
+                <w:i w:val="0"/>
+                <w:sz w:val="20"/>
+              </w:rPr>
+              <w:t>3. Zona</w:t>
+            </w:r>
+          </w:p>
+        </w:tc>
+        <w:tc>
+          <w:tcPr>
+            <w:tcW w:type="dxa" w:w="4986"/>
+          </w:tcPr>
+          <w:p>
+            <w:r/>
+            <w:r>
+              <w:rPr>
+                <w:b w:val="0"/>
+                <w:i w:val="0"/>
+                <w:sz w:val="20"/>
+              </w:rPr>
+              <w:t xml:space="preserve">Tiap paru dibagi </w:t>
+            </w:r>
+            <w:r>
+              <w:rPr>
+                <w:b/>
+                <w:i w:val="0"/>
+                <w:sz w:val="20"/>
+              </w:rPr>
+              <w:t>tiga sama rata</w:t>
+            </w:r>
+            <w:r>
+              <w:rPr>
+                <w:b w:val="0"/>
+                <w:i w:val="0"/>
+                <w:sz w:val="20"/>
+              </w:rPr>
+              <w:t>. Centang hanya zona yang ada lesi. Zona tanpa lesi tidak dicentang. Zona tidak perlu film pembanding, hanya mata</w:t>
+            </w:r>
+          </w:p>
+        </w:tc>
+      </w:tr>
+      <w:tr>
+        <w:tc>
+          <w:tcPr>
+            <w:tcW w:type="dxa" w:w="4986"/>
+          </w:tcPr>
+          <w:p>
+            <w:r/>
+            <w:r>
+              <w:rPr>
+                <w:b/>
+                <w:i w:val="0"/>
+                <w:sz w:val="20"/>
+              </w:rPr>
+              <w:t>4. Bentuk dan ukuran</w:t>
+            </w:r>
+          </w:p>
+        </w:tc>
+        <w:tc>
+          <w:tcPr>
+            <w:tcW w:type="dxa" w:w="4986"/>
+          </w:tcPr>
+          <w:p>
+            <w:r/>
+            <w:r>
+              <w:rPr>
+                <w:b w:val="0"/>
+                <w:i w:val="0"/>
+                <w:sz w:val="20"/>
+              </w:rPr>
+              <w:t xml:space="preserve">Ambil </w:t>
+            </w:r>
+            <w:r>
+              <w:rPr>
+                <w:b/>
+                <w:i w:val="0"/>
+                <w:sz w:val="20"/>
+              </w:rPr>
+              <w:t>hanya yang paling banyak (primer) dan kedua paling banyak (sekunder)</w:t>
+            </w:r>
+            <w:r>
+              <w:rPr>
+                <w:b w:val="0"/>
+                <w:i w:val="0"/>
+                <w:sz w:val="20"/>
+              </w:rPr>
+              <w:t xml:space="preserve">, tidak perlu tersier. </w:t>
+            </w:r>
+            <w:r>
+              <w:rPr>
+                <w:b/>
+                <w:i w:val="0"/>
+                <w:sz w:val="20"/>
+              </w:rPr>
+              <w:t>Tidak boleh loncat ukuran</w:t>
+            </w:r>
+            <w:r>
+              <w:rPr>
+                <w:b w:val="0"/>
+                <w:i w:val="0"/>
+                <w:sz w:val="20"/>
+              </w:rPr>
+              <w:t xml:space="preserve">: p dengan q atau q dengan r mungkin, tetapi </w:t>
+            </w:r>
+            <w:r>
+              <w:rPr>
+                <w:b/>
+                <w:i w:val="0"/>
+                <w:sz w:val="20"/>
+              </w:rPr>
+              <w:t>p dengan r atau r dengan p tidak mungkin</w:t>
+            </w:r>
+            <w:r>
+              <w:rPr>
+                <w:b w:val="0"/>
+                <w:i w:val="0"/>
+                <w:sz w:val="20"/>
+              </w:rPr>
+              <w:t xml:space="preserve"> (kecil tidak tiba-tiba menjadi besar, ia tumbuh bertahap). Kaidah praktis, tidak selalu: dominan </w:t>
+            </w:r>
+            <w:r>
+              <w:rPr>
+                <w:b/>
+                <w:i w:val="0"/>
+                <w:sz w:val="20"/>
+              </w:rPr>
+              <w:t>atas</w:t>
+            </w:r>
+            <w:r>
+              <w:rPr>
+                <w:b w:val="0"/>
+                <w:i w:val="0"/>
+                <w:sz w:val="20"/>
+              </w:rPr>
+              <w:t xml:space="preserve"> cenderung bulat (silikosis, p/q/r), dominan </w:t>
+            </w:r>
+            <w:r>
+              <w:rPr>
+                <w:b/>
+                <w:i w:val="0"/>
+                <w:sz w:val="20"/>
+              </w:rPr>
+              <w:t>bawah</w:t>
+            </w:r>
+            <w:r>
+              <w:rPr>
+                <w:b w:val="0"/>
+                <w:i w:val="0"/>
+                <w:sz w:val="20"/>
+              </w:rPr>
+              <w:t xml:space="preserve"> cenderung ireguler (asbes, s/t/u). Ukur dengan membandingkan ke film standar p, q, r, s, t, u. Bila ragu antara bulat dan ireguler, lokasi zona membantu</w:t>
+            </w:r>
+          </w:p>
+        </w:tc>
+      </w:tr>
+      <w:tr>
+        <w:tc>
+          <w:tcPr>
+            <w:tcW w:type="dxa" w:w="4986"/>
+          </w:tcPr>
+          <w:p>
+            <w:r/>
+            <w:r>
+              <w:rPr>
+                <w:b/>
+                <w:i w:val="0"/>
+                <w:sz w:val="20"/>
+              </w:rPr>
+              <w:t>5. Profusion</w:t>
+            </w:r>
+          </w:p>
+        </w:tc>
+        <w:tc>
+          <w:tcPr>
+            <w:tcW w:type="dxa" w:w="4986"/>
+          </w:tcPr>
+          <w:p>
+            <w:r/>
+            <w:r>
+              <w:rPr>
+                <w:b/>
+                <w:i w:val="0"/>
+                <w:sz w:val="20"/>
+              </w:rPr>
+              <w:t>Wajib membandingkan</w:t>
+            </w:r>
+            <w:r>
+              <w:rPr>
+                <w:b w:val="0"/>
+                <w:i w:val="0"/>
+                <w:sz w:val="20"/>
+              </w:rPr>
+              <w:t xml:space="preserve"> dengan film standar (bila tidak membandingkan lalu salah, tidak ada pembenaran). Dua pendekatan yang disebut: (1) bandingkan </w:t>
+            </w:r>
+            <w:r>
+              <w:rPr>
+                <w:b/>
+                <w:i w:val="0"/>
+                <w:sz w:val="20"/>
+              </w:rPr>
+              <w:t>dulu ke 0/0</w:t>
+            </w:r>
+            <w:r>
+              <w:rPr>
+                <w:b w:val="0"/>
+                <w:i w:val="0"/>
+                <w:sz w:val="20"/>
+              </w:rPr>
+              <w:t xml:space="preserve">, terutama bila sering terbawa "halu". Bila sama bersihnya dengan 0/0, kemungkinan memang normal. (2) bandingkan langsung ke </w:t>
+            </w:r>
+            <w:r>
+              <w:rPr>
+                <w:b/>
+                <w:i w:val="0"/>
+                <w:sz w:val="20"/>
+              </w:rPr>
+              <w:t>2/2 q/q atau 2/2 r/r</w:t>
+            </w:r>
+            <w:r>
+              <w:rPr>
+                <w:b w:val="0"/>
+                <w:i w:val="0"/>
+                <w:sz w:val="20"/>
+              </w:rPr>
+              <w:t xml:space="preserve"> karena kontrasnya paling jelas, lalu naik atau turun. Kunci pembeda normal: film 0/0 terlihat ramai oleh </w:t>
+            </w:r>
+            <w:r>
+              <w:rPr>
+                <w:b/>
+                <w:i w:val="0"/>
+                <w:sz w:val="20"/>
+              </w:rPr>
+              <w:t>corakan vaskular</w:t>
+            </w:r>
+            <w:r>
+              <w:rPr>
+                <w:b w:val="0"/>
+                <w:i w:val="0"/>
+                <w:sz w:val="20"/>
+              </w:rPr>
+              <w:t xml:space="preserve"> tetapi </w:t>
+            </w:r>
+            <w:r>
+              <w:rPr>
+                <w:b/>
+                <w:i w:val="0"/>
+                <w:sz w:val="20"/>
+              </w:rPr>
+              <w:t>tanpa "semut-semut" kecil</w:t>
+            </w:r>
+            <w:r>
+              <w:rPr>
+                <w:b w:val="0"/>
+                <w:i w:val="0"/>
+                <w:sz w:val="20"/>
+              </w:rPr>
+              <w:t xml:space="preserve">. Cari lesi di perifer, </w:t>
+            </w:r>
+            <w:r>
+              <w:rPr>
+                <w:b/>
+                <w:i w:val="0"/>
+                <w:sz w:val="20"/>
+              </w:rPr>
+              <w:t>jangan di dekat atau menempel pada corakan vaskular</w:t>
+            </w:r>
+            <w:r>
+              <w:rPr>
+                <w:b w:val="0"/>
+                <w:i w:val="0"/>
+                <w:sz w:val="20"/>
+              </w:rPr>
+              <w:t xml:space="preserve"> (lesi tidak menempel pada pembuluh)</w:t>
+            </w:r>
+          </w:p>
+        </w:tc>
+      </w:tr>
+      <w:tr>
+        <w:tc>
+          <w:tcPr>
+            <w:tcW w:type="dxa" w:w="4986"/>
+          </w:tcPr>
+          <w:p>
+            <w:r/>
+            <w:r>
+              <w:rPr>
+                <w:b/>
+                <w:i w:val="0"/>
+                <w:sz w:val="20"/>
+              </w:rPr>
+              <w:t>Menulis subkategori</w:t>
+            </w:r>
+          </w:p>
+        </w:tc>
+        <w:tc>
+          <w:tcPr>
+            <w:tcW w:type="dxa" w:w="4986"/>
+          </w:tcPr>
+          <w:p>
+            <w:r/>
+            <w:r>
+              <w:rPr>
+                <w:b/>
+                <w:i w:val="0"/>
+                <w:sz w:val="20"/>
+              </w:rPr>
+              <w:t>Angka depan</w:t>
+            </w:r>
+            <w:r>
+              <w:rPr>
+                <w:b w:val="0"/>
+                <w:i w:val="0"/>
+                <w:sz w:val="20"/>
+              </w:rPr>
+              <w:t xml:space="preserve"> = standar yang paling mirip. Mirip 2/2 tetapi lebih sepi: </w:t>
+            </w:r>
+            <w:r>
+              <w:rPr>
+                <w:b/>
+                <w:i w:val="0"/>
+                <w:sz w:val="20"/>
+              </w:rPr>
+              <w:t>2/1</w:t>
+            </w:r>
+            <w:r>
+              <w:rPr>
+                <w:b w:val="0"/>
+                <w:i w:val="0"/>
+                <w:sz w:val="20"/>
+              </w:rPr>
+              <w:t xml:space="preserve">. Mirip 2/2 tetapi lebih ramai dan belum 3/3: </w:t>
+            </w:r>
+            <w:r>
+              <w:rPr>
+                <w:b/>
+                <w:i w:val="0"/>
+                <w:sz w:val="20"/>
+              </w:rPr>
+              <w:t>2/3</w:t>
+            </w:r>
+            <w:r>
+              <w:rPr>
+                <w:b w:val="0"/>
+                <w:i w:val="0"/>
+                <w:sz w:val="20"/>
+              </w:rPr>
+              <w:t xml:space="preserve">. Mirip 1/1 tetapi lebih ramai: </w:t>
+            </w:r>
+            <w:r>
+              <w:rPr>
+                <w:b/>
+                <w:i w:val="0"/>
+                <w:sz w:val="20"/>
+              </w:rPr>
+              <w:t>1/2</w:t>
+            </w:r>
+            <w:r>
+              <w:rPr>
+                <w:b w:val="0"/>
+                <w:i w:val="0"/>
+                <w:sz w:val="20"/>
+              </w:rPr>
+              <w:t xml:space="preserve">. Mirip 1/1 tetapi lebih sepi dan tidak sebersih 0/0: </w:t>
+            </w:r>
+            <w:r>
+              <w:rPr>
+                <w:b/>
+                <w:i w:val="0"/>
+                <w:sz w:val="20"/>
+              </w:rPr>
+              <w:t>1/0</w:t>
+            </w:r>
+            <w:r>
+              <w:rPr>
+                <w:b w:val="0"/>
+                <w:i w:val="0"/>
+                <w:sz w:val="20"/>
+              </w:rPr>
+              <w:t xml:space="preserve">. Mirip 3/3 tetapi lebih sepi: </w:t>
+            </w:r>
+            <w:r>
+              <w:rPr>
+                <w:b/>
+                <w:i w:val="0"/>
+                <w:sz w:val="20"/>
+              </w:rPr>
+              <w:t>3/2</w:t>
+            </w:r>
+            <w:r>
+              <w:rPr>
+                <w:b w:val="0"/>
+                <w:i w:val="0"/>
+                <w:sz w:val="20"/>
+              </w:rPr>
+              <w:t xml:space="preserve">. Lebih ramai dari 3/3: </w:t>
+            </w:r>
+            <w:r>
+              <w:rPr>
+                <w:b/>
+                <w:i w:val="0"/>
+                <w:sz w:val="20"/>
+              </w:rPr>
+              <w:t>3/+</w:t>
+            </w:r>
+            <w:r>
+              <w:rPr>
+                <w:b w:val="0"/>
+                <w:i w:val="0"/>
+                <w:sz w:val="20"/>
+              </w:rPr>
+              <w:t>. Persis standar: angka kembar (2/2). Film standar hanya ada untuk 0/0, 1/1, 2/2, 3/3, jadi subkategori campuran ditentukan sendiri dari kemiripan</w:t>
+            </w:r>
+          </w:p>
+        </w:tc>
+      </w:tr>
+      <w:tr>
+        <w:tc>
+          <w:tcPr>
+            <w:tcW w:type="dxa" w:w="4986"/>
+          </w:tcPr>
+          <w:p>
+            <w:r/>
+            <w:r>
+              <w:rPr>
+                <w:b/>
+                <w:i w:val="0"/>
+                <w:sz w:val="20"/>
+              </w:rPr>
+              <w:t>6. Opasitas besar</w:t>
+            </w:r>
+          </w:p>
+        </w:tc>
+        <w:tc>
+          <w:tcPr>
+            <w:tcW w:type="dxa" w:w="4986"/>
+          </w:tcPr>
+          <w:p>
+            <w:r/>
+            <w:r>
+              <w:rPr>
+                <w:b/>
+                <w:i w:val="0"/>
+                <w:sz w:val="20"/>
+              </w:rPr>
+              <w:t>Opasitas besar adalah gabungan opasitas kecil</w:t>
+            </w:r>
+            <w:r>
+              <w:rPr>
+                <w:b w:val="0"/>
+                <w:i w:val="0"/>
+                <w:sz w:val="20"/>
+              </w:rPr>
+              <w:t xml:space="preserve">, jadi tidak mungkin ada large tanpa small. Bila terlihat massa besar tetapi tanpa p/q/r, pikirkan kelainan lain (mis. simbol ca atau od). Ukur </w:t>
+            </w:r>
+            <w:r>
+              <w:rPr>
+                <w:b/>
+                <w:i w:val="0"/>
+                <w:sz w:val="20"/>
+              </w:rPr>
+              <w:t>kira-kira tanpa penggaris</w:t>
+            </w:r>
+            <w:r>
+              <w:rPr>
+                <w:b w:val="0"/>
+                <w:i w:val="0"/>
+                <w:sz w:val="20"/>
+              </w:rPr>
+              <w:t xml:space="preserve">: 1-5 cm = A, &gt;5 cm sampai batas RUZ = B, lebih besar = C. </w:t>
+            </w:r>
+            <w:r>
+              <w:rPr>
+                <w:b/>
+                <w:i w:val="0"/>
+                <w:sz w:val="20"/>
+              </w:rPr>
+              <w:t>Semua large digabung</w:t>
+            </w:r>
+            <w:r>
+              <w:rPr>
+                <w:b w:val="0"/>
+                <w:i w:val="0"/>
+                <w:sz w:val="20"/>
+              </w:rPr>
+              <w:t xml:space="preserve"> untuk menentukan kategori</w:t>
+            </w:r>
+          </w:p>
+        </w:tc>
+      </w:tr>
+      <w:tr>
+        <w:tc>
+          <w:tcPr>
+            <w:tcW w:type="dxa" w:w="4986"/>
+          </w:tcPr>
+          <w:p>
+            <w:r/>
+            <w:r>
+              <w:rPr>
+                <w:b/>
+                <w:i w:val="0"/>
+                <w:sz w:val="20"/>
+              </w:rPr>
+              <w:t>7. Pleura (3A)</w:t>
+            </w:r>
+          </w:p>
+        </w:tc>
+        <w:tc>
+          <w:tcPr>
+            <w:tcW w:type="dxa" w:w="4986"/>
+          </w:tcPr>
+          <w:p>
+            <w:r/>
+            <w:r>
+              <w:rPr>
+                <w:b w:val="0"/>
+                <w:i w:val="0"/>
+                <w:sz w:val="20"/>
+              </w:rPr>
+              <w:t xml:space="preserve">Isi Yes atau No. Bila </w:t>
+            </w:r>
+            <w:r>
+              <w:rPr>
+                <w:b/>
+                <w:i w:val="0"/>
+                <w:sz w:val="20"/>
+              </w:rPr>
+              <w:t>No</w:t>
+            </w:r>
+            <w:r>
+              <w:rPr>
+                <w:b w:val="0"/>
+                <w:i w:val="0"/>
+                <w:sz w:val="20"/>
+              </w:rPr>
+              <w:t xml:space="preserve">, langsung lompat ke 4A, </w:t>
+            </w:r>
+            <w:r>
+              <w:rPr>
+                <w:b/>
+                <w:i w:val="0"/>
+                <w:sz w:val="20"/>
+              </w:rPr>
+              <w:t>tidak perlu mengisi 0 satu per satu</w:t>
+            </w:r>
+            <w:r>
+              <w:rPr>
+                <w:b w:val="0"/>
+                <w:i w:val="0"/>
+                <w:sz w:val="20"/>
+              </w:rPr>
+              <w:t xml:space="preserve"> dan 3B sampai 3D dikosongkan. Bila </w:t>
+            </w:r>
+            <w:r>
+              <w:rPr>
+                <w:b/>
+                <w:i w:val="0"/>
+                <w:sz w:val="20"/>
+              </w:rPr>
+              <w:t>Yes</w:t>
+            </w:r>
+            <w:r>
+              <w:rPr>
+                <w:b w:val="0"/>
+                <w:i w:val="0"/>
+                <w:sz w:val="20"/>
+              </w:rPr>
+              <w:t>, tiap baris yang diisi harus lengkap</w:t>
+            </w:r>
+          </w:p>
+        </w:tc>
+      </w:tr>
+      <w:tr>
+        <w:tc>
+          <w:tcPr>
+            <w:tcW w:type="dxa" w:w="4986"/>
+          </w:tcPr>
+          <w:p>
+            <w:r/>
+            <w:r>
+              <w:rPr>
+                <w:b/>
+                <w:i w:val="0"/>
+                <w:sz w:val="20"/>
+              </w:rPr>
+              <w:t>3B plak</w:t>
+            </w:r>
+          </w:p>
+        </w:tc>
+        <w:tc>
+          <w:tcPr>
+            <w:tcW w:type="dxa" w:w="4986"/>
+          </w:tcPr>
+          <w:p>
+            <w:r/>
+            <w:r>
+              <w:rPr>
+                <w:b w:val="0"/>
+                <w:i w:val="0"/>
+                <w:sz w:val="20"/>
+              </w:rPr>
+              <w:t xml:space="preserve">Satu baris per lokasi: in-profile (menempel di </w:t>
+            </w:r>
+            <w:r>
+              <w:rPr>
+                <w:b/>
+                <w:i w:val="0"/>
+                <w:sz w:val="20"/>
+              </w:rPr>
+              <w:t>tepi</w:t>
+            </w:r>
+            <w:r>
+              <w:rPr>
+                <w:b w:val="0"/>
+                <w:i w:val="0"/>
+                <w:sz w:val="20"/>
+              </w:rPr>
+              <w:t xml:space="preserve"> dinding dada), face-on (tampak di </w:t>
+            </w:r>
+            <w:r>
+              <w:rPr>
+                <w:b/>
+                <w:i w:val="0"/>
+                <w:sz w:val="20"/>
+              </w:rPr>
+              <w:t>depan paru</w:t>
+            </w:r>
+            <w:r>
+              <w:rPr>
+                <w:b w:val="0"/>
+                <w:i w:val="0"/>
+                <w:sz w:val="20"/>
+              </w:rPr>
+              <w:t xml:space="preserve"> seperti awan), diafragma, other sites. Tiap baris: kanan atau kiri, lalu kalsifikasi ada atau tidak. </w:t>
+            </w:r>
+            <w:r>
+              <w:rPr>
+                <w:b/>
+                <w:i w:val="0"/>
+                <w:sz w:val="20"/>
+              </w:rPr>
+              <w:t>Kalsifikasi tampak lebih terang (putih)</w:t>
+            </w:r>
+            <w:r>
+              <w:rPr>
+                <w:b w:val="0"/>
+                <w:i w:val="0"/>
+                <w:sz w:val="20"/>
+              </w:rPr>
+              <w:t xml:space="preserve"> dan biasanya jelas. </w:t>
+            </w:r>
+            <w:r>
+              <w:rPr>
+                <w:b/>
+                <w:i w:val="0"/>
+                <w:sz w:val="20"/>
+              </w:rPr>
+              <w:t>Bila tidak yakin ada kalsifikasi, pilih 0</w:t>
+            </w:r>
+            <w:r>
+              <w:rPr>
+                <w:b w:val="0"/>
+                <w:i w:val="0"/>
+                <w:sz w:val="20"/>
+              </w:rPr>
+              <w:t xml:space="preserve">. </w:t>
+            </w:r>
+            <w:r>
+              <w:rPr>
+                <w:b/>
+                <w:i w:val="0"/>
+                <w:sz w:val="20"/>
+              </w:rPr>
+              <w:t>Luas</w:t>
+            </w:r>
+            <w:r>
+              <w:rPr>
+                <w:b w:val="0"/>
+                <w:i w:val="0"/>
+                <w:sz w:val="20"/>
+              </w:rPr>
+              <w:t xml:space="preserve"> hanya untuk in-profile dan face-on, dibandingkan dengan panjang dinding dada lateral (≤¼ = 1, ¼-½ = 2, &gt;½ = 3). </w:t>
+            </w:r>
+            <w:r>
+              <w:rPr>
+                <w:b/>
+                <w:i w:val="0"/>
+                <w:sz w:val="20"/>
+              </w:rPr>
+              <w:t>Lebar</w:t>
+            </w:r>
+            <w:r>
+              <w:rPr>
+                <w:b w:val="0"/>
+                <w:i w:val="0"/>
+                <w:sz w:val="20"/>
+              </w:rPr>
+              <w:t xml:space="preserve"> hanya untuk in-profile (3-5 mm a, 5-10 mm b, &gt;10 mm c). Bila sisi tidak ada, kotak lebar tidak dicentang</w:t>
+            </w:r>
+          </w:p>
+        </w:tc>
+      </w:tr>
+      <w:tr>
+        <w:tc>
+          <w:tcPr>
+            <w:tcW w:type="dxa" w:w="4986"/>
+          </w:tcPr>
+          <w:p>
+            <w:r/>
+            <w:r>
+              <w:rPr>
+                <w:b/>
+                <w:i w:val="0"/>
+                <w:sz w:val="20"/>
+              </w:rPr>
+              <w:t>3C sudut kostofrenikus</w:t>
+            </w:r>
+          </w:p>
+        </w:tc>
+        <w:tc>
+          <w:tcPr>
+            <w:tcW w:type="dxa" w:w="4986"/>
+          </w:tcPr>
+          <w:p>
+            <w:r/>
+            <w:r>
+              <w:rPr>
+                <w:b w:val="0"/>
+                <w:i w:val="0"/>
+                <w:sz w:val="20"/>
+              </w:rPr>
+              <w:t xml:space="preserve">Paling sulit, gambarnya </w:t>
+            </w:r>
+            <w:r>
+              <w:rPr>
+                <w:b/>
+                <w:i w:val="0"/>
+                <w:sz w:val="20"/>
+              </w:rPr>
+              <w:t>mirip efusi pleura</w:t>
+            </w:r>
+            <w:r>
+              <w:rPr>
+                <w:b w:val="0"/>
+                <w:i w:val="0"/>
+                <w:sz w:val="20"/>
+              </w:rPr>
+              <w:t xml:space="preserve">. Bila </w:t>
+            </w:r>
+            <w:r>
+              <w:rPr>
+                <w:b/>
+                <w:i w:val="0"/>
+                <w:sz w:val="20"/>
+              </w:rPr>
+              <w:t>ada plak</w:t>
+            </w:r>
+            <w:r>
+              <w:rPr>
+                <w:b w:val="0"/>
+                <w:i w:val="0"/>
+                <w:sz w:val="20"/>
+              </w:rPr>
+              <w:t xml:space="preserve"> dan sudut tumpul: centang obliterasi. Bila </w:t>
+            </w:r>
+            <w:r>
+              <w:rPr>
+                <w:b/>
+                <w:i w:val="0"/>
+                <w:sz w:val="20"/>
+              </w:rPr>
+              <w:t>tanpa plak</w:t>
+            </w:r>
+            <w:r>
+              <w:rPr>
+                <w:b w:val="0"/>
+                <w:i w:val="0"/>
+                <w:sz w:val="20"/>
+              </w:rPr>
+              <w:t xml:space="preserve"> tetapi sudut tumpul: kemungkinan hanya efusi, jangan centang obliterasi, tandai simbol </w:t>
+            </w:r>
+            <w:r>
+              <w:rPr>
+                <w:b/>
+                <w:i w:val="0"/>
+                <w:sz w:val="20"/>
+              </w:rPr>
+              <w:t>ef</w:t>
+            </w:r>
+            <w:r>
+              <w:rPr>
+                <w:b w:val="0"/>
+                <w:i w:val="0"/>
+                <w:sz w:val="20"/>
+              </w:rPr>
+              <w:t>. Bila tidak yakin efusi atau obliterasi: boleh centang obliterasi sekaligus simbol ef. Pada film yang hanya efusi tanpa kelainan lain, 3A boleh No dan cukup simbol ef</w:t>
+            </w:r>
+          </w:p>
+        </w:tc>
+      </w:tr>
+      <w:tr>
+        <w:tc>
+          <w:tcPr>
+            <w:tcW w:type="dxa" w:w="4986"/>
+          </w:tcPr>
+          <w:p>
+            <w:r/>
+            <w:r>
+              <w:rPr>
+                <w:b/>
+                <w:i w:val="0"/>
+                <w:sz w:val="20"/>
+              </w:rPr>
+              <w:t>3D penebalan difus</w:t>
+            </w:r>
+          </w:p>
+        </w:tc>
+        <w:tc>
+          <w:tcPr>
+            <w:tcW w:type="dxa" w:w="4986"/>
+          </w:tcPr>
+          <w:p>
+            <w:r/>
+            <w:r>
+              <w:rPr>
+                <w:b w:val="0"/>
+                <w:i w:val="0"/>
+                <w:sz w:val="20"/>
+              </w:rPr>
+              <w:t xml:space="preserve">Hanya bila penebalan </w:t>
+            </w:r>
+            <w:r>
+              <w:rPr>
+                <w:b/>
+                <w:i w:val="0"/>
+                <w:sz w:val="20"/>
+              </w:rPr>
+              <w:t>bersambung dengan sudut kostofrenikus yang obliterasi</w:t>
+            </w:r>
+            <w:r>
+              <w:rPr>
+                <w:b w:val="0"/>
+                <w:i w:val="0"/>
+                <w:sz w:val="20"/>
+              </w:rPr>
+              <w:t xml:space="preserve">. Plak yang bersambung dari sudut ke atas dicatat sebagai </w:t>
+            </w:r>
+            <w:r>
+              <w:rPr>
+                <w:b/>
+                <w:i w:val="0"/>
+                <w:sz w:val="20"/>
+              </w:rPr>
+              <w:t>difus</w:t>
+            </w:r>
+            <w:r>
+              <w:rPr>
+                <w:b w:val="0"/>
+                <w:i w:val="0"/>
+                <w:sz w:val="20"/>
+              </w:rPr>
+              <w:t xml:space="preserve">, lalu baris in-profile untuk bagian itu </w:t>
+            </w:r>
+            <w:r>
+              <w:rPr>
+                <w:b/>
+                <w:i w:val="0"/>
+                <w:sz w:val="20"/>
+              </w:rPr>
+              <w:t>diisi 0 agar tidak terhitung dua kali</w:t>
+            </w:r>
+            <w:r>
+              <w:rPr>
+                <w:b w:val="0"/>
+                <w:i w:val="0"/>
+                <w:sz w:val="20"/>
+              </w:rPr>
+              <w:t>. Plak terpisah yang tidak bersambung dicatat sebagai plak in-profile. Sudut tumpul saja tanpa penebalan ke lateral = hanya 3C. Penebalan tebal tetapi tanpa obliterasi sudut bukan difus. Luas difus dihitung sejauh penebalan menyambung dari sudut</w:t>
+            </w:r>
+          </w:p>
+        </w:tc>
+      </w:tr>
+      <w:tr>
+        <w:tc>
+          <w:tcPr>
+            <w:tcW w:type="dxa" w:w="4986"/>
+          </w:tcPr>
+          <w:p>
+            <w:r/>
+            <w:r>
+              <w:rPr>
+                <w:b/>
+                <w:i w:val="0"/>
+                <w:sz w:val="20"/>
+              </w:rPr>
+              <w:t>8. Simbol</w:t>
+            </w:r>
+          </w:p>
+        </w:tc>
+        <w:tc>
+          <w:tcPr>
+            <w:tcW w:type="dxa" w:w="4986"/>
+          </w:tcPr>
+          <w:p>
+            <w:r/>
+            <w:r>
+              <w:rPr>
+                <w:b w:val="0"/>
+                <w:i w:val="0"/>
+                <w:sz w:val="20"/>
+              </w:rPr>
+              <w:t xml:space="preserve">Hafal singkatan. Contoh yang disebut: </w:t>
+            </w:r>
+            <w:r>
+              <w:rPr>
+                <w:b/>
+                <w:i w:val="0"/>
+                <w:sz w:val="20"/>
+              </w:rPr>
+              <w:t>aa</w:t>
+            </w:r>
+            <w:r>
+              <w:rPr>
+                <w:b w:val="0"/>
+                <w:i w:val="0"/>
+                <w:sz w:val="20"/>
+              </w:rPr>
+              <w:t xml:space="preserve"> aorta aterosklerotik, </w:t>
+            </w:r>
+            <w:r>
+              <w:rPr>
+                <w:b/>
+                <w:i w:val="0"/>
+                <w:sz w:val="20"/>
+              </w:rPr>
+              <w:t>at</w:t>
+            </w:r>
+            <w:r>
+              <w:rPr>
+                <w:b w:val="0"/>
+                <w:i w:val="0"/>
+                <w:sz w:val="20"/>
+              </w:rPr>
+              <w:t xml:space="preserve"> penebalan apikal, </w:t>
+            </w:r>
+            <w:r>
+              <w:rPr>
+                <w:b/>
+                <w:i w:val="0"/>
+                <w:sz w:val="20"/>
+              </w:rPr>
+              <w:t>ax</w:t>
+            </w:r>
+            <w:r>
+              <w:rPr>
+                <w:b w:val="0"/>
+                <w:i w:val="0"/>
+                <w:sz w:val="20"/>
+              </w:rPr>
+              <w:t xml:space="preserve"> opasitas kecil yang berkumpul (prekursor large), </w:t>
+            </w:r>
+            <w:r>
+              <w:rPr>
+                <w:b/>
+                <w:i w:val="0"/>
+                <w:sz w:val="20"/>
+              </w:rPr>
+              <w:t>ca</w:t>
+            </w:r>
+            <w:r>
+              <w:rPr>
+                <w:b w:val="0"/>
+                <w:i w:val="0"/>
+                <w:sz w:val="20"/>
+              </w:rPr>
+              <w:t xml:space="preserve"> curiga kanker (nodul bulat mencurigakan), </w:t>
+            </w:r>
+            <w:r>
+              <w:rPr>
+                <w:b/>
+                <w:i w:val="0"/>
+                <w:sz w:val="20"/>
+              </w:rPr>
+              <w:t>me</w:t>
+            </w:r>
+            <w:r>
+              <w:rPr>
+                <w:b w:val="0"/>
+                <w:i w:val="0"/>
+                <w:sz w:val="20"/>
+              </w:rPr>
+              <w:t xml:space="preserve"> mesotelioma (penebalan in-profile sangat tebal), </w:t>
+            </w:r>
+            <w:r>
+              <w:rPr>
+                <w:b/>
+                <w:i w:val="0"/>
+                <w:sz w:val="20"/>
+              </w:rPr>
+              <w:t>co</w:t>
+            </w:r>
+            <w:r>
+              <w:rPr>
+                <w:b w:val="0"/>
+                <w:i w:val="0"/>
+                <w:sz w:val="20"/>
+              </w:rPr>
+              <w:t xml:space="preserve"> kelainan ukuran/bentuk jantung (kardiomegali), </w:t>
+            </w:r>
+            <w:r>
+              <w:rPr>
+                <w:b/>
+                <w:i w:val="0"/>
+                <w:sz w:val="20"/>
+              </w:rPr>
+              <w:t>bu</w:t>
+            </w:r>
+            <w:r>
+              <w:rPr>
+                <w:b w:val="0"/>
+                <w:i w:val="0"/>
+                <w:sz w:val="20"/>
+              </w:rPr>
+              <w:t xml:space="preserve"> bula, </w:t>
+            </w:r>
+            <w:r>
+              <w:rPr>
+                <w:b/>
+                <w:i w:val="0"/>
+                <w:sz w:val="20"/>
+              </w:rPr>
+              <w:t>tb</w:t>
+            </w:r>
+            <w:r>
+              <w:rPr>
+                <w:b w:val="0"/>
+                <w:i w:val="0"/>
+                <w:sz w:val="20"/>
+              </w:rPr>
+              <w:t xml:space="preserve"> tuberkulosis. Temuan non-paru seperti kardiomegali tetap dilaporkan lewat simbol</w:t>
+            </w:r>
+          </w:p>
+        </w:tc>
+      </w:tr>
+      <w:tr>
+        <w:tc>
+          <w:tcPr>
+            <w:tcW w:type="dxa" w:w="4986"/>
+          </w:tcPr>
+          <w:p>
+            <w:r/>
+            <w:r>
+              <w:rPr>
+                <w:b/>
+                <w:i w:val="0"/>
+                <w:sz w:val="20"/>
+              </w:rPr>
+              <w:t>Jawaban lisan</w:t>
+            </w:r>
+          </w:p>
+        </w:tc>
+        <w:tc>
+          <w:tcPr>
+            <w:tcW w:type="dxa" w:w="4986"/>
+          </w:tcPr>
+          <w:p>
+            <w:r/>
+            <w:r>
+              <w:rPr>
+                <w:b w:val="0"/>
+                <w:i w:val="0"/>
+                <w:sz w:val="20"/>
+              </w:rPr>
+              <w:t xml:space="preserve">Pada stasiun ILO penguji </w:t>
+            </w:r>
+            <w:r>
+              <w:rPr>
+                <w:b/>
+                <w:i w:val="0"/>
+                <w:sz w:val="20"/>
+              </w:rPr>
+              <w:t>diam tanpa komentar</w:t>
+            </w:r>
+            <w:r>
+              <w:rPr>
+                <w:b w:val="0"/>
+                <w:i w:val="0"/>
+                <w:sz w:val="20"/>
+              </w:rPr>
+              <w:t xml:space="preserve"> (berbeda dengan stasiun lain yang memancing). Pengalaman pembicara: </w:t>
+            </w:r>
+            <w:r>
+              <w:rPr>
+                <w:b/>
+                <w:i w:val="0"/>
+                <w:sz w:val="20"/>
+              </w:rPr>
+              <w:t>mengucapkan sambil mengisi</w:t>
+            </w:r>
+            <w:r>
+              <w:rPr>
+                <w:b w:val="0"/>
+                <w:i w:val="0"/>
+                <w:sz w:val="20"/>
+              </w:rPr>
+              <w:t xml:space="preserve"> ("kualitas 2 karena underexposed dan improper position, lalu parenkim, saya bandingkan dengan standar 0/0...") membuat penguji tahu alur berpikir</w:t>
+            </w:r>
+          </w:p>
+        </w:tc>
+      </w:tr>
+    </w:tbl>
+    <w:p>
+      <w:pPr>
+        <w:spacing w:after="40"/>
+      </w:pPr>
+    </w:p>
+    <w:p>
+      <w:pPr>
+        <w:pStyle w:val="Heading3"/>
+      </w:pPr>
+      <w:r>
+        <w:t>Format stasiun ILO dan taktik fisik (dari pengalaman angkatan sebelumnya)</w:t>
+      </w:r>
+    </w:p>
+    <w:tbl>
+      <w:tblPr>
+        <w:tblStyle w:val="TableGrid"/>
+        <w:tblW w:type="auto" w:w="0"/>
+        <w:tblLook w:firstColumn="1" w:firstRow="1" w:lastColumn="0" w:lastRow="0" w:noHBand="0" w:noVBand="1" w:val="04A0"/>
+      </w:tblPr>
+      <w:tblGrid>
+        <w:gridCol w:w="4986"/>
+        <w:gridCol w:w="4986"/>
+      </w:tblGrid>
+      <w:tr>
+        <w:trPr>
+          <w:tblHeader w:val="true"/>
+        </w:trPr>
+        <w:tc>
+          <w:tcPr>
+            <w:tcW w:type="dxa" w:w="4986"/>
+            <w:shd w:val="clear" w:color="auto" w:fill="1F3A5F"/>
+          </w:tcPr>
+          <w:p>
+            <w:r>
+              <w:rPr>
+                <w:color w:val="FFFFFF"/>
+              </w:rPr>
+            </w:r>
+            <w:r>
+              <w:rPr>
+                <w:b/>
+                <w:i w:val="0"/>
+                <w:color w:val="FFFFFF"/>
+                <w:sz w:val="20"/>
+              </w:rPr>
+              <w:t>Hal</w:t>
+            </w:r>
+          </w:p>
+        </w:tc>
+        <w:tc>
+          <w:tcPr>
+            <w:tcW w:type="dxa" w:w="4986"/>
+            <w:shd w:val="clear" w:color="auto" w:fill="1F3A5F"/>
+          </w:tcPr>
+          <w:p>
+            <w:r>
+              <w:rPr>
+                <w:color w:val="FFFFFF"/>
+              </w:rPr>
+            </w:r>
+            <w:r>
+              <w:rPr>
+                <w:b/>
+                <w:i w:val="0"/>
+                <w:color w:val="FFFFFF"/>
+                <w:sz w:val="20"/>
+              </w:rPr>
+              <w:t>Isi</w:t>
+            </w:r>
+          </w:p>
+        </w:tc>
+      </w:tr>
+      <w:tr>
+        <w:tc>
+          <w:tcPr>
+            <w:tcW w:type="dxa" w:w="4986"/>
+          </w:tcPr>
+          <w:p>
+            <w:r/>
+            <w:r>
+              <w:rPr>
+                <w:b/>
+                <w:i w:val="0"/>
+                <w:sz w:val="20"/>
+              </w:rPr>
+              <w:t>Soal</w:t>
+            </w:r>
+          </w:p>
+        </w:tc>
+        <w:tc>
+          <w:tcPr>
+            <w:tcW w:type="dxa" w:w="4986"/>
+          </w:tcPr>
+          <w:p>
+            <w:r/>
+            <w:r>
+              <w:rPr>
+                <w:b w:val="0"/>
+                <w:i w:val="0"/>
+                <w:sz w:val="20"/>
+              </w:rPr>
+              <w:t>Cerita singkat: laki-laki, umur, bekerja di mana (mis. tambang), keluhan (mis. batuk), diperiksa dengan ILO. Sering tanpa durasi kerja dan tanpa jenis tambang. Tugas: isi lembar baca lalu beri rekomendasi</w:t>
+            </w:r>
+          </w:p>
+        </w:tc>
+      </w:tr>
+      <w:tr>
+        <w:tc>
+          <w:tcPr>
+            <w:tcW w:type="dxa" w:w="4986"/>
+          </w:tcPr>
+          <w:p>
+            <w:r/>
+            <w:r>
+              <w:rPr>
+                <w:b/>
+                <w:i w:val="0"/>
+                <w:sz w:val="20"/>
+              </w:rPr>
+              <w:t>Pertanyaan yang diingat</w:t>
+            </w:r>
+          </w:p>
+        </w:tc>
+        <w:tc>
+          <w:tcPr>
+            <w:tcW w:type="dxa" w:w="4986"/>
+          </w:tcPr>
+          <w:p>
+            <w:r/>
+            <w:r>
+              <w:rPr>
+                <w:b w:val="0"/>
+                <w:i w:val="0"/>
+                <w:sz w:val="20"/>
+              </w:rPr>
+              <w:t xml:space="preserve">Apakah lesi </w:t>
+            </w:r>
+            <w:r>
+              <w:rPr>
+                <w:b/>
+                <w:i w:val="0"/>
+                <w:sz w:val="20"/>
+              </w:rPr>
+              <w:t>berhubungan dengan pekerjaan</w:t>
+            </w:r>
+            <w:r>
+              <w:rPr>
+                <w:b w:val="0"/>
+                <w:i w:val="0"/>
+                <w:sz w:val="20"/>
+              </w:rPr>
+              <w:t xml:space="preserve">, lalu </w:t>
+            </w:r>
+            <w:r>
+              <w:rPr>
+                <w:b/>
+                <w:i w:val="0"/>
+                <w:sz w:val="20"/>
+              </w:rPr>
+              <w:t>tatalaksana okupasi</w:t>
+            </w:r>
+            <w:r>
+              <w:rPr>
+                <w:b w:val="0"/>
+                <w:i w:val="0"/>
+                <w:sz w:val="20"/>
+              </w:rPr>
+              <w:t xml:space="preserve"> (boleh tetap bekerja di situ atau tidak, rujuk atau tidak, penilaian kelaikan kerja). </w:t>
+            </w:r>
+            <w:r>
+              <w:rPr>
+                <w:b/>
+                <w:i w:val="0"/>
+                <w:sz w:val="20"/>
+              </w:rPr>
+              <w:t>Diagnosis tidak ditanyakan</w:t>
+            </w:r>
+            <w:r>
+              <w:rPr>
+                <w:b w:val="0"/>
+                <w:i w:val="0"/>
+                <w:sz w:val="20"/>
+              </w:rPr>
+              <w:t xml:space="preserve"> karena sudah tersirat. Bila film normal, jawaban yang benar adalah normal dan tidak perlu dirujuk</w:t>
+            </w:r>
+          </w:p>
+        </w:tc>
+      </w:tr>
+      <w:tr>
+        <w:tc>
+          <w:tcPr>
+            <w:tcW w:type="dxa" w:w="4986"/>
+          </w:tcPr>
+          <w:p>
+            <w:r/>
+            <w:r>
+              <w:rPr>
+                <w:b/>
+                <w:i w:val="0"/>
+                <w:sz w:val="20"/>
+              </w:rPr>
+              <w:t>Waktu</w:t>
+            </w:r>
+          </w:p>
+        </w:tc>
+        <w:tc>
+          <w:tcPr>
+            <w:tcW w:type="dxa" w:w="4986"/>
+          </w:tcPr>
+          <w:p>
+            <w:r/>
+            <w:r>
+              <w:rPr>
+                <w:b w:val="0"/>
+                <w:i w:val="0"/>
+                <w:sz w:val="20"/>
+              </w:rPr>
+              <w:t>Ada waktu membaca soal sekitar satu menit, lalu masuk. Ada penanda waktu mendekati habis. Total sekitar lima menit (</w:t>
+            </w:r>
+            <w:r>
+              <w:rPr>
+                <w:b/>
+                <w:i w:val="0"/>
+                <w:color w:val="C00000"/>
+                <w:sz w:val="20"/>
+              </w:rPr>
+              <w:t>[VERIFIKASI]</w:t>
+            </w:r>
+            <w:r>
+              <w:rPr>
+                <w:b w:val="0"/>
+                <w:i w:val="0"/>
+                <w:sz w:val="20"/>
+              </w:rPr>
+              <w:t xml:space="preserve"> pembicara menyebut lupa pasti, konfirmasi ke senior)</w:t>
+            </w:r>
+          </w:p>
+        </w:tc>
+      </w:tr>
+      <w:tr>
+        <w:tc>
+          <w:tcPr>
+            <w:tcW w:type="dxa" w:w="4986"/>
+          </w:tcPr>
+          <w:p>
+            <w:r/>
+            <w:r>
+              <w:rPr>
+                <w:b/>
+                <w:i w:val="0"/>
+                <w:sz w:val="20"/>
+              </w:rPr>
+              <w:t>Alat</w:t>
+            </w:r>
+          </w:p>
+        </w:tc>
+        <w:tc>
+          <w:tcPr>
+            <w:tcW w:type="dxa" w:w="4986"/>
+          </w:tcPr>
+          <w:p>
+            <w:r/>
+            <w:r>
+              <w:rPr>
+                <w:b w:val="0"/>
+                <w:i w:val="0"/>
+                <w:sz w:val="20"/>
+              </w:rPr>
+              <w:t xml:space="preserve">Film standar cetak dalam satu set bernomor, view box (jumlah lampu belum pasti, ada kemungkinan hanya satu), film standar bisa dipasang setengah-setengah di sebelah film kasus. </w:t>
+            </w:r>
+            <w:r>
+              <w:rPr>
+                <w:b/>
+                <w:i w:val="0"/>
+                <w:sz w:val="20"/>
+              </w:rPr>
+              <w:t>Jangan mengacak set standar</w:t>
+            </w:r>
+            <w:r>
+              <w:rPr>
+                <w:b w:val="0"/>
+                <w:i w:val="0"/>
+                <w:sz w:val="20"/>
+              </w:rPr>
+              <w:t>: setiap peserta mengembalikan film ke nomor semula agar peserta berikutnya tidak bingung. Satu angkatan sebaiknya sepakat ambil dari dan kembalikan ke nomor yang sama</w:t>
+            </w:r>
+          </w:p>
+        </w:tc>
+      </w:tr>
+      <w:tr>
+        <w:tc>
+          <w:tcPr>
+            <w:tcW w:type="dxa" w:w="4986"/>
+          </w:tcPr>
+          <w:p>
+            <w:r/>
+            <w:r>
+              <w:rPr>
+                <w:b/>
+                <w:i w:val="0"/>
+                <w:sz w:val="20"/>
+              </w:rPr>
+              <w:t>Persiapan</w:t>
+            </w:r>
+          </w:p>
+        </w:tc>
+        <w:tc>
+          <w:tcPr>
+            <w:tcW w:type="dxa" w:w="4986"/>
+          </w:tcPr>
+          <w:p>
+            <w:r/>
+            <w:r>
+              <w:rPr>
+                <w:b w:val="0"/>
+                <w:i w:val="0"/>
+                <w:sz w:val="20"/>
+              </w:rPr>
+              <w:t>Film standar bisa diunduh (set di folder ILO) untuk dilihat sendiri. Praktikum film cetak biasanya lewat dosen B Reader, tetapi pada tahun penguji tidak boleh mengajar. Jadwalkan latihan bersama dalam kelompok. Peserta berkacamata jangan lupa membawa kacamata. Jangan melihat film lama-lama</w:t>
+            </w:r>
+          </w:p>
+        </w:tc>
+      </w:tr>
+      <w:tr>
+        <w:tc>
+          <w:tcPr>
+            <w:tcW w:type="dxa" w:w="4986"/>
+          </w:tcPr>
+          <w:p>
+            <w:r/>
+            <w:r>
+              <w:rPr>
+                <w:b/>
+                <w:i w:val="0"/>
+                <w:sz w:val="20"/>
+              </w:rPr>
+              <w:t>Latihan senior</w:t>
+            </w:r>
+          </w:p>
+        </w:tc>
+        <w:tc>
+          <w:tcPr>
+            <w:tcW w:type="dxa" w:w="4986"/>
+          </w:tcPr>
+          <w:p>
+            <w:r/>
+            <w:r>
+              <w:rPr>
+                <w:b w:val="0"/>
+                <w:i w:val="0"/>
+                <w:sz w:val="20"/>
+              </w:rPr>
+              <w:t>Peserta kelompok sebelumnya belajar sekitar satu bulan: sesi pagi dan sore, bahas MCQ, simulasi soal OSCE (audiometri, spirometri), dan membuat soal tambahan dari materi</w:t>
+            </w:r>
+          </w:p>
+        </w:tc>
+      </w:tr>
+      <w:tr>
+        <w:tc>
+          <w:tcPr>
+            <w:tcW w:type="dxa" w:w="4986"/>
+          </w:tcPr>
+          <w:p>
+            <w:r/>
+            <w:r>
+              <w:rPr>
+                <w:b/>
+                <w:i w:val="0"/>
+                <w:sz w:val="20"/>
+              </w:rPr>
+              <w:t>Kesalahan klasik</w:t>
+            </w:r>
+          </w:p>
+        </w:tc>
+        <w:tc>
+          <w:tcPr>
+            <w:tcW w:type="dxa" w:w="4986"/>
+          </w:tcPr>
+          <w:p>
+            <w:r/>
+            <w:r>
+              <w:rPr>
+                <w:b w:val="0"/>
+                <w:i w:val="0"/>
+                <w:sz w:val="20"/>
+              </w:rPr>
+              <w:t>Menganggap film pasti ada kelainan, lalu "memaksakan" PP atau 0/1 pada film normal. Menjawab primer dan sekunder yang loncat ukuran. Mengisi 3B sampai 3D padahal 3A No. Mencatat plak dua kali (sebagai in-profile dan sebagai difus)</w:t>
+            </w:r>
+          </w:p>
+        </w:tc>
+      </w:tr>
+    </w:tbl>
+    <w:p>
+      <w:pPr>
+        <w:spacing w:after="40"/>
+      </w:pPr>
+    </w:p>
+    <w:p>
+      <w:r>
+        <w:rPr>
+          <w:b/>
+          <w:i w:val="0"/>
+        </w:rPr>
+        <w:t>Catatan sumber.</w:t>
+      </w:r>
+      <w:r>
+        <w:rPr>
+          <w:b w:val="0"/>
+          <w:i w:val="0"/>
+        </w:rPr>
+        <w:t xml:space="preserve"> Seluruh gambar berasal dari ILO Guidelines 2022 (wcms_867859.pdf) dan set ILO standard digital images (ilo-radiographs-jpegs.zip) di folder Materi Board\ILO. Video diskusi board (3. Diskusi Board 20260519 Mbak Venny, 1 jam 52 menit) saya transkrip lokal dengan WhisperX (tanpa unggah), lalu saya cocokkan dengan cuplikan bingkai: urutan diskusinya identik dengan lembar baca di atas. Tips di atas adalah ringkasan transkrip, dan angka atau aturan klasifikasi selalu mengikuti ILO Guidelines 2022.</w:t>
       </w:r>
     </w:p>
     <w:p>
@@ -15292,7 +17067,91 @@
           <w:b w:val="0"/>
           <w:i w:val="0"/>
         </w:rPr>
-        <w:t>, sebut profusion dengan perbandingan ke film standar.</w:t>
+        <w:t xml:space="preserve">, sebut profusion dengan perbandingan ke film standar. Dari pengalaman angkatan sebelumnya (diskusi board 19 Mei 2026): </w:t>
+      </w:r>
+      <w:r>
+        <w:rPr>
+          <w:b/>
+          <w:i w:val="0"/>
+        </w:rPr>
+        <w:t>film normal sering keluar</w:t>
+      </w:r>
+      <w:r>
+        <w:rPr>
+          <w:b w:val="0"/>
+          <w:i w:val="0"/>
+        </w:rPr>
+        <w:t xml:space="preserve">, jadi bandingkan dulu dengan 0/0 sebelum memutuskan ada kelainan. </w:t>
+      </w:r>
+      <w:r>
+        <w:rPr>
+          <w:b/>
+          <w:i w:val="0"/>
+        </w:rPr>
+        <w:t>Jangan melihat film terlalu lama</w:t>
+      </w:r>
+      <w:r>
+        <w:rPr>
+          <w:b w:val="0"/>
+          <w:i w:val="0"/>
+        </w:rPr>
+        <w:t xml:space="preserve"> (makin lama makin terlihat hal yang tidak ada). Primer dan sekunder </w:t>
+      </w:r>
+      <w:r>
+        <w:rPr>
+          <w:b/>
+          <w:i w:val="0"/>
+        </w:rPr>
+        <w:t>tidak boleh loncat ukuran</w:t>
+      </w:r>
+      <w:r>
+        <w:rPr>
+          <w:b w:val="0"/>
+          <w:i w:val="0"/>
+        </w:rPr>
+        <w:t xml:space="preserve"> (p dengan r tidak mungkin). Bila 3A = No, </w:t>
+      </w:r>
+      <w:r>
+        <w:rPr>
+          <w:b/>
+          <w:i w:val="0"/>
+        </w:rPr>
+        <w:t>langsung ke 4A</w:t>
+      </w:r>
+      <w:r>
+        <w:rPr>
+          <w:b w:val="0"/>
+          <w:i w:val="0"/>
+        </w:rPr>
+        <w:t xml:space="preserve">. </w:t>
+      </w:r>
+      <w:r>
+        <w:rPr>
+          <w:b/>
+          <w:i w:val="0"/>
+        </w:rPr>
+        <w:t>Ucapkan alur pikir sambil mengisi</w:t>
+      </w:r>
+      <w:r>
+        <w:rPr>
+          <w:b w:val="0"/>
+          <w:i w:val="0"/>
+        </w:rPr>
+        <w:t xml:space="preserve"> karena penguji diam. </w:t>
+      </w:r>
+      <w:r>
+        <w:rPr>
+          <w:b/>
+          <w:i w:val="0"/>
+        </w:rPr>
+        <w:t>Kembalikan film standar ke nomor semula</w:t>
+      </w:r>
+      <w:r>
+        <w:rPr>
+          <w:b w:val="0"/>
+          <w:i w:val="0"/>
+        </w:rPr>
+        <w:t>. Pertanyaan yang biasa diajukan: apakah lesi berhubungan dengan pekerjaan dan tatalaksana okupasinya (boleh kerja di situ atau tidak, rujuk atau tidak).</w:t>
       </w:r>
     </w:p>
     <w:p>

</xml_diff>